<commit_message>
Expand viva handbook with deeper technical coverage.
Add detailed role-wise code logic, long-form viva answers, architecture rationale, and failure handling discussion.

Made-with: Cursor
</commit_message>
<xml_diff>
--- a/QuizForge_Viva_Rolewise_Handbook.docx
+++ b/QuizForge_Viva_Rolewise_Handbook.docx
@@ -7,7 +7,7 @@
         <w:pStyle w:val="Title"/>
       </w:pPr>
       <w:r>
-        <w:t>QuizForge Major Project Viva Handbook</w:t>
+        <w:t>QuizForge - Detailed Viva Rolewise Handbook</w:t>
       </w:r>
     </w:p>
     <w:p>
@@ -15,7 +15,7 @@
         <w:rPr>
           <w:b w:val="0"/>
         </w:rPr>
-        <w:t>Purpose: This document divides the project into 4 accountable roles and provides deep, viva-ready preparation for architecture, code flow, decisions, and troubleshooting.</w:t>
+        <w:t>This document is a deep viva preparation guide with role ownership, internal code logic, design rationale, edge cases, and detailed model answers.</w:t>
       </w:r>
     </w:p>
     <w:p>
@@ -23,7 +23,7 @@
         <w:rPr>
           <w:b w:val="0"/>
         </w:rPr>
-        <w:t>Project: QuizForge - AI powered quiz and flashcard generation from uploaded study files.</w:t>
+        <w:t>Project Theme: AI powered automatic quiz and flashcard generation from uploaded academic content.</w:t>
       </w:r>
     </w:p>
     <w:p>
@@ -31,7 +31,7 @@
         <w:pStyle w:val="Heading1"/>
       </w:pPr>
       <w:r>
-        <w:t>1) Project Overview (What this project is)</w:t>
+        <w:t>A. Executive Summary</w:t>
       </w:r>
     </w:p>
     <w:p>
@@ -39,7 +39,7 @@
         <w:pStyle w:val="ListBullet"/>
       </w:pPr>
       <w:r>
-        <w:t>QuizForge is a Flask web application that converts study materials into quizzes and flashcards.</w:t>
+        <w:t>QuizForge is a Flask-based full-stack project that transforms passive study material into active recall tools.</w:t>
       </w:r>
     </w:p>
     <w:p>
@@ -47,7 +47,7 @@
         <w:pStyle w:val="ListBullet"/>
       </w:pPr>
       <w:r>
-        <w:t>A user uploads a file, text is extracted, AI generates output, and results are saved per user account.</w:t>
+        <w:t>Users upload files (PDF/image/DOCX/PPTX), text is extracted, AI generates structured content, and outputs are saved user-wise.</w:t>
       </w:r>
     </w:p>
     <w:p>
@@ -55,7 +55,7 @@
         <w:pStyle w:val="ListBullet"/>
       </w:pPr>
       <w:r>
-        <w:t>The app supports PDF, images, DOCX, and PPTX uploads.</w:t>
+        <w:t>The application includes authentication, content generation, score tracking, and history management.</w:t>
       </w:r>
     </w:p>
     <w:p>
@@ -63,7 +63,7 @@
         <w:pStyle w:val="ListBullet"/>
       </w:pPr>
       <w:r>
-        <w:t>Users can register/login, generate content, attempt quizzes, save score, and manage history.</w:t>
+        <w:t>Core architecture follows a modular separation: route layer, extraction layer, AI layer, and persistence layer.</w:t>
       </w:r>
     </w:p>
     <w:p>
@@ -71,7 +71,7 @@
         <w:pStyle w:val="Heading1"/>
       </w:pPr>
       <w:r>
-        <w:t>2) Technology Stack</w:t>
+        <w:t>B. Detailed Architecture</w:t>
       </w:r>
     </w:p>
     <w:p>
@@ -79,7 +79,7 @@
         <w:pStyle w:val="ListBullet"/>
       </w:pPr>
       <w:r>
-        <w:t>Backend: Python + Flask</w:t>
+        <w:t>Presentation Layer: HTML templates in templates/ directory.</w:t>
       </w:r>
     </w:p>
     <w:p>
@@ -87,7 +87,7 @@
         <w:pStyle w:val="ListBullet"/>
       </w:pPr>
       <w:r>
-        <w:t>Database: SQLite (quizforge.db)</w:t>
+        <w:t>Application Layer: app.py manages endpoints, session control, and orchestration.</w:t>
       </w:r>
     </w:p>
     <w:p>
@@ -95,7 +95,7 @@
         <w:pStyle w:val="ListBullet"/>
       </w:pPr>
       <w:r>
-        <w:t>Frontend: HTML templates in templates/ with CSS/JS</w:t>
+        <w:t>Service Layer: extractor.py (content ingestion) and ai_generator.py (LLM generation).</w:t>
       </w:r>
     </w:p>
     <w:p>
@@ -103,7 +103,7 @@
         <w:pStyle w:val="ListBullet"/>
       </w:pPr>
       <w:r>
-        <w:t>AI Integration: Groq API (llama-3.3-70b-versatile)</w:t>
+        <w:t>Data Layer: database.py wraps SQLite operations with helper functions.</w:t>
       </w:r>
     </w:p>
     <w:p>
@@ -111,111 +111,7 @@
         <w:pStyle w:val="ListBullet"/>
       </w:pPr>
       <w:r>
-        <w:t>Text Extraction: pdfplumber, pytesseract, python-docx, python-pptx</w:t>
-      </w:r>
-    </w:p>
-    <w:p>
-      <w:pPr>
-        <w:pStyle w:val="ListBullet"/>
-      </w:pPr>
-      <w:r>
-        <w:t>Security basics: password hashing via Werkzeug</w:t>
-      </w:r>
-    </w:p>
-    <w:p>
-      <w:pPr>
-        <w:pStyle w:val="ListBullet"/>
-      </w:pPr>
-      <w:r>
-        <w:t>Configuration: .env with GROQ_API_KEY</w:t>
-      </w:r>
-    </w:p>
-    <w:p>
-      <w:pPr>
-        <w:pStyle w:val="Heading1"/>
-      </w:pPr>
-      <w:r>
-        <w:t>3) End-to-End Workflow</w:t>
-      </w:r>
-    </w:p>
-    <w:p>
-      <w:pPr>
-        <w:pStyle w:val="ListBullet"/>
-      </w:pPr>
-      <w:r>
-        <w:t>Step 1: User opens home page and registers or logs in.</w:t>
-      </w:r>
-    </w:p>
-    <w:p>
-      <w:pPr>
-        <w:pStyle w:val="ListBullet"/>
-      </w:pPr>
-      <w:r>
-        <w:t>Step 2: User chooses mode (quiz or flashcards).</w:t>
-      </w:r>
-    </w:p>
-    <w:p>
-      <w:pPr>
-        <w:pStyle w:val="ListBullet"/>
-      </w:pPr>
-      <w:r>
-        <w:t>Step 3: User uploads a file and selects number of items.</w:t>
-      </w:r>
-    </w:p>
-    <w:p>
-      <w:pPr>
-        <w:pStyle w:val="ListBullet"/>
-      </w:pPr>
-      <w:r>
-        <w:t>Step 4: Backend validates file, saves it in uploads/, and extracts text.</w:t>
-      </w:r>
-    </w:p>
-    <w:p>
-      <w:pPr>
-        <w:pStyle w:val="ListBullet"/>
-      </w:pPr>
-      <w:r>
-        <w:t>Step 5: If extracted text is insufficient, app returns an error.</w:t>
-      </w:r>
-    </w:p>
-    <w:p>
-      <w:pPr>
-        <w:pStyle w:val="ListBullet"/>
-      </w:pPr>
-      <w:r>
-        <w:t>Step 6: App sends extracted text to AI generator with strict JSON prompt.</w:t>
-      </w:r>
-    </w:p>
-    <w:p>
-      <w:pPr>
-        <w:pStyle w:val="ListBullet"/>
-      </w:pPr>
-      <w:r>
-        <w:t>Step 7: AI output is parsed and stored in SQLite against current user.</w:t>
-      </w:r>
-    </w:p>
-    <w:p>
-      <w:pPr>
-        <w:pStyle w:val="ListBullet"/>
-      </w:pPr>
-      <w:r>
-        <w:t>Step 8: User is redirected to quiz or flashcard page for interaction.</w:t>
-      </w:r>
-    </w:p>
-    <w:p>
-      <w:pPr>
-        <w:pStyle w:val="ListBullet"/>
-      </w:pPr>
-      <w:r>
-        <w:t>Step 9: User can view history and delete saved entries.</w:t>
-      </w:r>
-    </w:p>
-    <w:p>
-      <w:pPr>
-        <w:pStyle w:val="Heading1"/>
-      </w:pPr>
-      <w:r>
-        <w:t>4) Role Distribution (4 Members, 4 Accountabilities)</w:t>
+        <w:t>Configuration Layer: .env for GROQ_API_KEY and runtime defaults.</w:t>
       </w:r>
     </w:p>
     <w:p>
@@ -223,31 +119,31 @@
         <w:rPr>
           <w:b/>
         </w:rPr>
-        <w:t>Role 1: Backend and App Flow Engineer</w:t>
+        <w:t>Request lifecycle in one line:</w:t>
       </w:r>
     </w:p>
     <w:p>
-      <w:pPr>
-        <w:pStyle w:val="ListBullet"/>
-      </w:pPr>
       <w:r>
-        <w:t>Primary ownership: app.py route design and request lifecycle.</w:t>
+        <w:rPr>
+          <w:b w:val="0"/>
+        </w:rPr>
+        <w:t>Browser -&gt; Flask route -&gt; validation -&gt; extractor -&gt; AI generator -&gt; DB write -&gt; template render/redirect -&gt; browser response.</w:t>
       </w:r>
     </w:p>
     <w:p>
       <w:pPr>
-        <w:pStyle w:val="ListBullet"/>
+        <w:pStyle w:val="Heading1"/>
       </w:pPr>
       <w:r>
-        <w:t>Core routes: /, /register, /login, /logout, /dashboard, /choose, /upload/&lt;mode&gt;, /process, /quiz/&lt;id&gt;, /flashcard/&lt;id&gt;, /history.</w:t>
+        <w:t>C. Role Distribution with Deep Technical Ownership</w:t>
       </w:r>
     </w:p>
     <w:p>
       <w:pPr>
-        <w:pStyle w:val="ListBullet"/>
+        <w:pStyle w:val="Heading2"/>
       </w:pPr>
       <w:r>
-        <w:t>Session management: stores user_id and user_name after successful login.</w:t>
+        <w:t>Role 1 - Backend and Routing Engineer</w:t>
       </w:r>
     </w:p>
     <w:p>
@@ -255,7 +151,7 @@
         <w:pStyle w:val="ListBullet"/>
       </w:pPr>
       <w:r>
-        <w:t>Access control: login_required decorator blocks protected pages for unauthenticated users.</w:t>
+        <w:t>Owns app.py route map, control flow, session state, and integration sequence.</w:t>
       </w:r>
     </w:p>
     <w:p>
@@ -263,7 +159,23 @@
         <w:pStyle w:val="ListBullet"/>
       </w:pPr>
       <w:r>
-        <w:t>Error handling: returns user-friendly template errors for invalid uploads and missing data.</w:t>
+        <w:t>Handles route-level validation and user navigation coherence.</w:t>
+      </w:r>
+    </w:p>
+    <w:p>
+      <w:pPr>
+        <w:pStyle w:val="ListBullet"/>
+      </w:pPr>
+      <w:r>
+        <w:t>Guarantees protected endpoints are accessible only after authentication.</w:t>
+      </w:r>
+    </w:p>
+    <w:p>
+      <w:pPr>
+        <w:pStyle w:val="ListBullet"/>
+      </w:pPr>
+      <w:r>
+        <w:t>Responsible for converting service outputs into user-facing pages.</w:t>
       </w:r>
     </w:p>
     <w:p>
@@ -271,47 +183,79 @@
         <w:rPr>
           <w:b/>
         </w:rPr>
-        <w:t>Role 1 - Viva Questions and Answers</w:t>
+        <w:t>Important code logic snippets to explain:</w:t>
       </w:r>
     </w:p>
     <w:p>
-      <w:pPr>
-        <w:pStyle w:val="ListBullet"/>
-      </w:pPr>
       <w:r>
-        <w:t>Q: Why use Flask? A: It is lightweight, modular, and ideal for rapid full-stack Python development.</w:t>
+        <w:rPr>
+          <w:rFonts w:ascii="Consolas" w:hAnsi="Consolas"/>
+          <w:sz w:val="20"/>
+        </w:rPr>
+        <w:t>@app.route('/process', methods=['POST'])</w:t>
       </w:r>
     </w:p>
     <w:p>
-      <w:pPr>
-        <w:pStyle w:val="ListBullet"/>
-      </w:pPr>
       <w:r>
-        <w:t>Q: How are routes protected? A: With login_required decorator checking session['user_id'].</w:t>
+        <w:rPr>
+          <w:rFonts w:ascii="Consolas" w:hAnsi="Consolas"/>
+          <w:sz w:val="20"/>
+        </w:rPr>
+        <w:t>mode = request.form.get('mode')</w:t>
       </w:r>
     </w:p>
     <w:p>
-      <w:pPr>
-        <w:pStyle w:val="ListBullet"/>
-      </w:pPr>
       <w:r>
-        <w:t>Q: What happens at /process? A: Validate input, save file, extract text, call AI, persist results, redirect.</w:t>
+        <w:rPr>
+          <w:rFonts w:ascii="Consolas" w:hAnsi="Consolas"/>
+          <w:sz w:val="20"/>
+        </w:rPr>
+        <w:t>file = request.files.get('file')</w:t>
       </w:r>
     </w:p>
     <w:p>
-      <w:pPr>
-        <w:pStyle w:val="ListBullet"/>
-      </w:pPr>
       <w:r>
-        <w:t>Q: Why use secure_filename? A: Prevents unsafe filename issues during upload.</w:t>
+        <w:rPr>
+          <w:rFonts w:ascii="Consolas" w:hAnsi="Consolas"/>
+          <w:sz w:val="20"/>
+        </w:rPr>
+        <w:t>if not allowed_file(file.filename): return render_template('upload.html', error='File type not supported.')</w:t>
       </w:r>
     </w:p>
     <w:p>
-      <w:pPr>
-        <w:pStyle w:val="ListBullet"/>
-      </w:pPr>
       <w:r>
-        <w:t>Q: How does app start? A: app.run(host='0.0.0.0', port=PORT or 5000).</w:t>
+        <w:rPr>
+          <w:rFonts w:ascii="Consolas" w:hAnsi="Consolas"/>
+          <w:sz w:val="20"/>
+        </w:rPr>
+        <w:t>text = extract_text(file_path)</w:t>
+      </w:r>
+    </w:p>
+    <w:p>
+      <w:r>
+        <w:rPr>
+          <w:rFonts w:ascii="Consolas" w:hAnsi="Consolas"/>
+          <w:sz w:val="20"/>
+        </w:rPr>
+        <w:t>if len(text.strip()) &lt; 100: return render_template('upload.html', error='Could not extract enough text.')</w:t>
+      </w:r>
+    </w:p>
+    <w:p>
+      <w:r>
+        <w:rPr>
+          <w:rFonts w:ascii="Consolas" w:hAnsi="Consolas"/>
+          <w:sz w:val="20"/>
+        </w:rPr>
+        <w:t>if mode == 'quiz': questions = generate_quiz(text, num_questions=num)</w:t>
+      </w:r>
+    </w:p>
+    <w:p>
+      <w:r>
+        <w:rPr>
+          <w:rFonts w:ascii="Consolas" w:hAnsi="Consolas"/>
+          <w:sz w:val="20"/>
+        </w:rPr>
+        <w:t>elif mode == 'flash': cards = generate_flashcards(text, num_cards=num)</w:t>
       </w:r>
     </w:p>
     <w:p>
@@ -319,7 +263,721 @@
         <w:rPr>
           <w:b/>
         </w:rPr>
-        <w:t>Role 1 - Accountability statement:</w:t>
+        <w:t>Detailed viva Q&amp;A for Role 1:</w:t>
+      </w:r>
+    </w:p>
+    <w:p>
+      <w:pPr>
+        <w:pStyle w:val="ListBullet"/>
+      </w:pPr>
+      <w:r>
+        <w:t>Q: Why did you create login_required decorator instead of repeating checks in each route? A: To centralize authentication policy, reduce code duplication, and avoid missing access checks accidentally. It applies single-point security enforcement to protected routes like /dashboard, /upload, /process, /history.</w:t>
+      </w:r>
+    </w:p>
+    <w:p>
+      <w:pPr>
+        <w:pStyle w:val="ListBullet"/>
+      </w:pPr>
+      <w:r>
+        <w:t>Q: Why redirect after successful form submissions? A: We follow Post/Redirect/Get style to prevent duplicate resubmission on browser refresh and to provide clean URL transitions.</w:t>
+      </w:r>
+    </w:p>
+    <w:p>
+      <w:pPr>
+        <w:pStyle w:val="ListBullet"/>
+      </w:pPr>
+      <w:r>
+        <w:t>Q: Why use secure_filename on uploads? A: Uploaded filenames may contain path traversal sequences or special characters. secure_filename normalizes the name and protects filesystem writes.</w:t>
+      </w:r>
+    </w:p>
+    <w:p>
+      <w:pPr>
+        <w:pStyle w:val="ListBullet"/>
+      </w:pPr>
+      <w:r>
+        <w:t>Q: What is the purpose of mode in /upload/&lt;mode&gt; and /process? A: mode acts as a strategy selector that determines whether the same upload pipeline should call quiz generation or flashcard generation.</w:t>
+      </w:r>
+    </w:p>
+    <w:p>
+      <w:pPr>
+        <w:pStyle w:val="ListBullet"/>
+      </w:pPr>
+      <w:r>
+        <w:t>Q: If generation fails in production, where would you add handling? A: Around extraction and AI calls in /process, using try/except, logging, and user-safe error messages with retry guidance.</w:t>
+      </w:r>
+    </w:p>
+    <w:p>
+      <w:pPr>
+        <w:pStyle w:val="Heading2"/>
+      </w:pPr>
+      <w:r>
+        <w:t>Role 2 - AI Integration and Prompt Engineering Engineer</w:t>
+      </w:r>
+    </w:p>
+    <w:p>
+      <w:pPr>
+        <w:pStyle w:val="ListBullet"/>
+      </w:pPr>
+      <w:r>
+        <w:t>Owns ai_generator.py, model invocation, output shaping, and parsing robustness.</w:t>
+      </w:r>
+    </w:p>
+    <w:p>
+      <w:pPr>
+        <w:pStyle w:val="ListBullet"/>
+      </w:pPr>
+      <w:r>
+        <w:t>Designs strict prompts for deterministic JSON schema-like output.</w:t>
+      </w:r>
+    </w:p>
+    <w:p>
+      <w:pPr>
+        <w:pStyle w:val="ListBullet"/>
+      </w:pPr>
+      <w:r>
+        <w:t>Ensures generated data maps directly to frontend templates and DB schema.</w:t>
+      </w:r>
+    </w:p>
+    <w:p>
+      <w:pPr>
+        <w:pStyle w:val="ListBullet"/>
+      </w:pPr>
+      <w:r>
+        <w:t>Maintains balance between creativity and reliability using generation parameters.</w:t>
+      </w:r>
+    </w:p>
+    <w:p>
+      <w:r>
+        <w:rPr>
+          <w:b/>
+        </w:rPr>
+        <w:t>Important code logic snippets to explain:</w:t>
+      </w:r>
+    </w:p>
+    <w:p>
+      <w:r>
+        <w:rPr>
+          <w:rFonts w:ascii="Consolas" w:hAnsi="Consolas"/>
+          <w:sz w:val="20"/>
+        </w:rPr>
+        <w:t>client = Groq(api_key=os.getenv('GROQ_API_KEY'))</w:t>
+      </w:r>
+    </w:p>
+    <w:p>
+      <w:r>
+        <w:rPr>
+          <w:rFonts w:ascii="Consolas" w:hAnsi="Consolas"/>
+          <w:sz w:val="20"/>
+        </w:rPr>
+        <w:t>prompt = f'''... Return ONLY a valid JSON array ...'''</w:t>
+      </w:r>
+    </w:p>
+    <w:p>
+      <w:r>
+        <w:rPr>
+          <w:rFonts w:ascii="Consolas" w:hAnsi="Consolas"/>
+          <w:sz w:val="20"/>
+        </w:rPr>
+        <w:t>response = client.chat.completions.create(model='llama-3.3-70b-versatile', ...)</w:t>
+      </w:r>
+    </w:p>
+    <w:p>
+      <w:r>
+        <w:rPr>
+          <w:rFonts w:ascii="Consolas" w:hAnsi="Consolas"/>
+          <w:sz w:val="20"/>
+        </w:rPr>
+        <w:t>raw = response.choices[0].message.content.strip()</w:t>
+      </w:r>
+    </w:p>
+    <w:p>
+      <w:r>
+        <w:rPr>
+          <w:rFonts w:ascii="Consolas" w:hAnsi="Consolas"/>
+          <w:sz w:val="20"/>
+        </w:rPr>
+        <w:t>raw = re.sub(r'```json|```', '', raw).strip()</w:t>
+      </w:r>
+    </w:p>
+    <w:p>
+      <w:r>
+        <w:rPr>
+          <w:rFonts w:ascii="Consolas" w:hAnsi="Consolas"/>
+          <w:sz w:val="20"/>
+        </w:rPr>
+        <w:t>questions = json.loads(raw)</w:t>
+      </w:r>
+    </w:p>
+    <w:p>
+      <w:r>
+        <w:rPr>
+          <w:b/>
+        </w:rPr>
+        <w:t>Detailed viva Q&amp;A for Role 2:</w:t>
+      </w:r>
+    </w:p>
+    <w:p>
+      <w:pPr>
+        <w:pStyle w:val="ListBullet"/>
+      </w:pPr>
+      <w:r>
+        <w:t>Q: Why prompt with explicit format examples? A: LLMs perform better when output constraints are concrete. We include exact key names and structure so parsing is reliable and templates can consume data directly.</w:t>
+      </w:r>
+    </w:p>
+    <w:p>
+      <w:pPr>
+        <w:pStyle w:val="ListBullet"/>
+      </w:pPr>
+      <w:r>
+        <w:t>Q: Why remove markdown fences before parsing? A: Models sometimes return JSON wrapped in ```json blocks. Without cleanup, json.loads would raise parsing errors.</w:t>
+      </w:r>
+    </w:p>
+    <w:p>
+      <w:pPr>
+        <w:pStyle w:val="ListBullet"/>
+      </w:pPr>
+      <w:r>
+        <w:t>Q: Why keep text[:6000] in prompt? A: To control token size, cost, latency, and model context overflow risk while still preserving enough source material for quality questions.</w:t>
+      </w:r>
+    </w:p>
+    <w:p>
+      <w:pPr>
+        <w:pStyle w:val="ListBullet"/>
+      </w:pPr>
+      <w:r>
+        <w:t>Q: How do you improve malformed output handling? A: Add JSON schema validation, fallback re-prompt with correction prompt, and exception-safe response to user.</w:t>
+      </w:r>
+    </w:p>
+    <w:p>
+      <w:pPr>
+        <w:pStyle w:val="ListBullet"/>
+      </w:pPr>
+      <w:r>
+        <w:t>Q: Why temperature 0.7? A: It keeps outputs varied enough for learning value while not becoming too random or drifting from source material.</w:t>
+      </w:r>
+    </w:p>
+    <w:p>
+      <w:pPr>
+        <w:pStyle w:val="Heading2"/>
+      </w:pPr>
+      <w:r>
+        <w:t>Role 3 - Content Extraction and Preprocessing Engineer</w:t>
+      </w:r>
+    </w:p>
+    <w:p>
+      <w:pPr>
+        <w:pStyle w:val="ListBullet"/>
+      </w:pPr>
+      <w:r>
+        <w:t>Owns extractor.py and data readiness checks before AI generation.</w:t>
+      </w:r>
+    </w:p>
+    <w:p>
+      <w:pPr>
+        <w:pStyle w:val="ListBullet"/>
+      </w:pPr>
+      <w:r>
+        <w:t>Maintains support matrix for document/image types.</w:t>
+      </w:r>
+    </w:p>
+    <w:p>
+      <w:pPr>
+        <w:pStyle w:val="ListBullet"/>
+      </w:pPr>
+      <w:r>
+        <w:t>Optimizes extraction quality and handles format-specific parsing behavior.</w:t>
+      </w:r>
+    </w:p>
+    <w:p>
+      <w:pPr>
+        <w:pStyle w:val="ListBullet"/>
+      </w:pPr>
+      <w:r>
+        <w:t>Responsible for minimizing garbage-in to improve AI output relevance.</w:t>
+      </w:r>
+    </w:p>
+    <w:p>
+      <w:r>
+        <w:rPr>
+          <w:b/>
+        </w:rPr>
+        <w:t>Important code logic snippets to explain:</w:t>
+      </w:r>
+    </w:p>
+    <w:p>
+      <w:r>
+        <w:rPr>
+          <w:rFonts w:ascii="Consolas" w:hAnsi="Consolas"/>
+          <w:sz w:val="20"/>
+        </w:rPr>
+        <w:t>ext = os.path.splitext(file_path)[1].lower()</w:t>
+      </w:r>
+    </w:p>
+    <w:p>
+      <w:r>
+        <w:rPr>
+          <w:rFonts w:ascii="Consolas" w:hAnsi="Consolas"/>
+          <w:sz w:val="20"/>
+        </w:rPr>
+        <w:t>if ext == '.pdf': return extract_from_pdf(file_path)</w:t>
+      </w:r>
+    </w:p>
+    <w:p>
+      <w:r>
+        <w:rPr>
+          <w:rFonts w:ascii="Consolas" w:hAnsi="Consolas"/>
+          <w:sz w:val="20"/>
+        </w:rPr>
+        <w:t>elif ext in ['.png', '.jpg', '.jpeg', '.webp']: return extract_from_image(file_path)</w:t>
+      </w:r>
+    </w:p>
+    <w:p>
+      <w:r>
+        <w:rPr>
+          <w:rFonts w:ascii="Consolas" w:hAnsi="Consolas"/>
+          <w:sz w:val="20"/>
+        </w:rPr>
+        <w:t>elif ext == '.docx': return extract_from_docx(file_path)</w:t>
+      </w:r>
+    </w:p>
+    <w:p>
+      <w:r>
+        <w:rPr>
+          <w:rFonts w:ascii="Consolas" w:hAnsi="Consolas"/>
+          <w:sz w:val="20"/>
+        </w:rPr>
+        <w:t>elif ext in ['.pptx', '.ppt']: return extract_from_pptx(file_path)</w:t>
+      </w:r>
+    </w:p>
+    <w:p>
+      <w:r>
+        <w:rPr>
+          <w:rFonts w:ascii="Consolas" w:hAnsi="Consolas"/>
+          <w:sz w:val="20"/>
+        </w:rPr>
+        <w:t>pytesseract.pytesseract.tesseract_cmd = r'C:\Program Files\Tesseract-OCR\tesseract.exe'</w:t>
+      </w:r>
+    </w:p>
+    <w:p>
+      <w:r>
+        <w:rPr>
+          <w:b/>
+        </w:rPr>
+        <w:t>Detailed viva Q&amp;A for Role 3:</w:t>
+      </w:r>
+    </w:p>
+    <w:p>
+      <w:pPr>
+        <w:pStyle w:val="ListBullet"/>
+      </w:pPr>
+      <w:r>
+        <w:t>Q: Why not send raw files directly to AI? A: Model APIs require textual context. Extractor converts heterogeneous documents to a unified plain-text representation first.</w:t>
+      </w:r>
+    </w:p>
+    <w:p>
+      <w:pPr>
+        <w:pStyle w:val="ListBullet"/>
+      </w:pPr>
+      <w:r>
+        <w:t>Q: Why OCR dependency is external? A: pytesseract is a Python wrapper; actual OCR engine is native Tesseract executable, so path configuration is required.</w:t>
+      </w:r>
+    </w:p>
+    <w:p>
+      <w:pPr>
+        <w:pStyle w:val="ListBullet"/>
+      </w:pPr>
+      <w:r>
+        <w:t>Q: What is key extraction risk for scanned PDFs? A: If PDF has only image layers and no embedded text, pdfplumber can return empty; OCR fallback for scanned PDFs can be added as enhancement.</w:t>
+      </w:r>
+    </w:p>
+    <w:p>
+      <w:pPr>
+        <w:pStyle w:val="ListBullet"/>
+      </w:pPr>
+      <w:r>
+        <w:t>Q: Why check minimum extracted text length? A: Low textual context leads to hallucinated or poor quality content; minimum threshold preserves educational usefulness.</w:t>
+      </w:r>
+    </w:p>
+    <w:p>
+      <w:pPr>
+        <w:pStyle w:val="ListBullet"/>
+      </w:pPr>
+      <w:r>
+        <w:t>Q: How to improve extraction quality further? A: Add preprocessing (denoise, thresholding), language packs, and per-format fallback chains.</w:t>
+      </w:r>
+    </w:p>
+    <w:p>
+      <w:pPr>
+        <w:pStyle w:val="Heading2"/>
+      </w:pPr>
+      <w:r>
+        <w:t>Role 4 - Database, Persistence, and Frontend Delivery Engineer</w:t>
+      </w:r>
+    </w:p>
+    <w:p>
+      <w:pPr>
+        <w:pStyle w:val="ListBullet"/>
+      </w:pPr>
+      <w:r>
+        <w:t>Owns database.py and template-driven user experience.</w:t>
+      </w:r>
+    </w:p>
+    <w:p>
+      <w:pPr>
+        <w:pStyle w:val="ListBullet"/>
+      </w:pPr>
+      <w:r>
+        <w:t>Designs relational schema and persistence lifecycle for generated artifacts.</w:t>
+      </w:r>
+    </w:p>
+    <w:p>
+      <w:pPr>
+        <w:pStyle w:val="ListBullet"/>
+      </w:pPr>
+      <w:r>
+        <w:t>Ensures users see personalized, saved, and retrievable study content.</w:t>
+      </w:r>
+    </w:p>
+    <w:p>
+      <w:pPr>
+        <w:pStyle w:val="ListBullet"/>
+      </w:pPr>
+      <w:r>
+        <w:t>Maintains frontend continuity from generation to history and deletion actions.</w:t>
+      </w:r>
+    </w:p>
+    <w:p>
+      <w:r>
+        <w:rPr>
+          <w:b/>
+        </w:rPr>
+        <w:t>Important code logic snippets to explain:</w:t>
+      </w:r>
+    </w:p>
+    <w:p>
+      <w:r>
+        <w:rPr>
+          <w:rFonts w:ascii="Consolas" w:hAnsi="Consolas"/>
+          <w:sz w:val="20"/>
+        </w:rPr>
+        <w:t>CREATE TABLE users (... email TEXT UNIQUE NOT NULL, password TEXT NOT NULL ...)</w:t>
+      </w:r>
+    </w:p>
+    <w:p>
+      <w:r>
+        <w:rPr>
+          <w:rFonts w:ascii="Consolas" w:hAnsi="Consolas"/>
+          <w:sz w:val="20"/>
+        </w:rPr>
+        <w:t>CREATE TABLE saved_quizzes (... questions TEXT NOT NULL, score TEXT DEFAULT NULL ...)</w:t>
+      </w:r>
+    </w:p>
+    <w:p>
+      <w:r>
+        <w:rPr>
+          <w:rFonts w:ascii="Consolas" w:hAnsi="Consolas"/>
+          <w:sz w:val="20"/>
+        </w:rPr>
+        <w:t>CREATE TABLE saved_flashcards (... cards TEXT NOT NULL ...)</w:t>
+      </w:r>
+    </w:p>
+    <w:p>
+      <w:r>
+        <w:rPr>
+          <w:rFonts w:ascii="Consolas" w:hAnsi="Consolas"/>
+          <w:sz w:val="20"/>
+        </w:rPr>
+        <w:t>cursor.execute('INSERT INTO saved_quizzes ...', (user_id, title, json.dumps(questions)))</w:t>
+      </w:r>
+    </w:p>
+    <w:p>
+      <w:r>
+        <w:rPr>
+          <w:rFonts w:ascii="Consolas" w:hAnsi="Consolas"/>
+          <w:sz w:val="20"/>
+        </w:rPr>
+        <w:t>cursor.execute('UPDATE saved_quizzes SET score = ? WHERE id = ?', (score, quiz_id))</w:t>
+      </w:r>
+    </w:p>
+    <w:p>
+      <w:r>
+        <w:rPr>
+          <w:rFonts w:ascii="Consolas" w:hAnsi="Consolas"/>
+          <w:sz w:val="20"/>
+        </w:rPr>
+        <w:t>SELECT * FROM saved_quizzes WHERE user_id = ? ORDER BY created_at DESC</w:t>
+      </w:r>
+    </w:p>
+    <w:p>
+      <w:r>
+        <w:rPr>
+          <w:b/>
+        </w:rPr>
+        <w:t>Detailed viva Q&amp;A for Role 4:</w:t>
+      </w:r>
+    </w:p>
+    <w:p>
+      <w:pPr>
+        <w:pStyle w:val="ListBullet"/>
+      </w:pPr>
+      <w:r>
+        <w:t>Q: Why store questions/cards as TEXT JSON instead of normalized child tables? A: For this project scope, JSON storage reduces schema complexity and maps directly to variable-length AI outputs. In production, normalized schema may help analytics and querying.</w:t>
+      </w:r>
+    </w:p>
+    <w:p>
+      <w:pPr>
+        <w:pStyle w:val="ListBullet"/>
+      </w:pPr>
+      <w:r>
+        <w:t>Q: How is password security handled? A: Plain password is never stored. Registration hashes password using generate_password_hash and login verifies using check_password_hash.</w:t>
+      </w:r>
+    </w:p>
+    <w:p>
+      <w:pPr>
+        <w:pStyle w:val="ListBullet"/>
+      </w:pPr>
+      <w:r>
+        <w:t>Q: Why SQLite? A: Zero-setup, lightweight file DB ideal for demonstration and moderate local usage. Production can migrate to PostgreSQL without changing high-level architecture.</w:t>
+      </w:r>
+    </w:p>
+    <w:p>
+      <w:pPr>
+        <w:pStyle w:val="ListBullet"/>
+      </w:pPr>
+      <w:r>
+        <w:t>Q: How is user data isolation maintained? A: Each quiz/flashcard row stores user_id; every history query filters by current session user_id.</w:t>
+      </w:r>
+    </w:p>
+    <w:p>
+      <w:pPr>
+        <w:pStyle w:val="ListBullet"/>
+      </w:pPr>
+      <w:r>
+        <w:t>Q: Why order by created_at DESC? A: UX-first choice to show latest generated content first for faster access.</w:t>
+      </w:r>
+    </w:p>
+    <w:p>
+      <w:pPr>
+        <w:pStyle w:val="Heading1"/>
+      </w:pPr>
+      <w:r>
+        <w:t>D. Full Code Logic Map (Function-wise)</w:t>
+      </w:r>
+    </w:p>
+    <w:p>
+      <w:pPr>
+        <w:pStyle w:val="ListBullet"/>
+      </w:pPr>
+      <w:r>
+        <w:t>allowed_file(filename): validates extension against whitelist.</w:t>
+      </w:r>
+    </w:p>
+    <w:p>
+      <w:pPr>
+        <w:pStyle w:val="ListBullet"/>
+      </w:pPr>
+      <w:r>
+        <w:t>login_required(f): wrapper that redirects unauthenticated users to login page.</w:t>
+      </w:r>
+    </w:p>
+    <w:p>
+      <w:pPr>
+        <w:pStyle w:val="ListBullet"/>
+      </w:pPr>
+      <w:r>
+        <w:t>register/login/logout: account lifecycle and session initialization/cleanup.</w:t>
+      </w:r>
+    </w:p>
+    <w:p>
+      <w:pPr>
+        <w:pStyle w:val="ListBullet"/>
+      </w:pPr>
+      <w:r>
+        <w:t>process(): central pipeline that coordinates upload, extraction, AI generation, DB save, and redirect.</w:t>
+      </w:r>
+    </w:p>
+    <w:p>
+      <w:pPr>
+        <w:pStyle w:val="ListBullet"/>
+      </w:pPr>
+      <w:r>
+        <w:t>quiz()/flashcard(): fetch persisted JSON text, deserialize with json.loads, render template.</w:t>
+      </w:r>
+    </w:p>
+    <w:p>
+      <w:pPr>
+        <w:pStyle w:val="ListBullet"/>
+      </w:pPr>
+      <w:r>
+        <w:t>save_score(): AJAX endpoint that updates quiz score asynchronously.</w:t>
+      </w:r>
+    </w:p>
+    <w:p>
+      <w:pPr>
+        <w:pStyle w:val="ListBullet"/>
+      </w:pPr>
+      <w:r>
+        <w:t>history(): combines quiz and flashcard history and computes item counts for display.</w:t>
+      </w:r>
+    </w:p>
+    <w:p>
+      <w:pPr>
+        <w:pStyle w:val="ListBullet"/>
+      </w:pPr>
+      <w:r>
+        <w:t>delete routes: remove persisted artifacts from DB.</w:t>
+      </w:r>
+    </w:p>
+    <w:p>
+      <w:pPr>
+        <w:pStyle w:val="Heading1"/>
+      </w:pPr>
+      <w:r>
+        <w:t>E. Design Decisions and Justifications</w:t>
+      </w:r>
+    </w:p>
+    <w:p>
+      <w:pPr>
+        <w:pStyle w:val="ListBullet"/>
+      </w:pPr>
+      <w:r>
+        <w:t>Single app.py chosen for clarity and easier viva explanation; modular helpers still keep separation of concerns.</w:t>
+      </w:r>
+    </w:p>
+    <w:p>
+      <w:pPr>
+        <w:pStyle w:val="ListBullet"/>
+      </w:pPr>
+      <w:r>
+        <w:t>Synchronous pipeline selected for simplicity; async jobs can be future enhancement.</w:t>
+      </w:r>
+    </w:p>
+    <w:p>
+      <w:pPr>
+        <w:pStyle w:val="ListBullet"/>
+      </w:pPr>
+      <w:r>
+        <w:t>Template rendering used over SPA to keep stack minimal and development faster.</w:t>
+      </w:r>
+    </w:p>
+    <w:p>
+      <w:pPr>
+        <w:pStyle w:val="ListBullet"/>
+      </w:pPr>
+      <w:r>
+        <w:t>JSON output contract from AI selected to reduce transformation code and template complexity.</w:t>
+      </w:r>
+    </w:p>
+    <w:p>
+      <w:pPr>
+        <w:pStyle w:val="Heading1"/>
+      </w:pPr>
+      <w:r>
+        <w:t>F. Failure Scenarios and Recovery Answers (High-value viva)</w:t>
+      </w:r>
+    </w:p>
+    <w:p>
+      <w:pPr>
+        <w:pStyle w:val="ListBullet"/>
+      </w:pPr>
+      <w:r>
+        <w:t>Missing GROQ_API_KEY -&gt; AI client initialization fails. Recovery: set key in .env and restart.</w:t>
+      </w:r>
+    </w:p>
+    <w:p>
+      <w:pPr>
+        <w:pStyle w:val="ListBullet"/>
+      </w:pPr>
+      <w:r>
+        <w:t>Unsupported file extension -&gt; process route returns upload template with clear error.</w:t>
+      </w:r>
+    </w:p>
+    <w:p>
+      <w:pPr>
+        <w:pStyle w:val="ListBullet"/>
+      </w:pPr>
+      <w:r>
+        <w:t>Low text extraction -&gt; app refuses generation and asks for better file.</w:t>
+      </w:r>
+    </w:p>
+    <w:p>
+      <w:pPr>
+        <w:pStyle w:val="ListBullet"/>
+      </w:pPr>
+      <w:r>
+        <w:t>Malformed AI JSON -&gt; json.loads fails. Recommended fix: try/except + repair prompt + fallback message.</w:t>
+      </w:r>
+    </w:p>
+    <w:p>
+      <w:pPr>
+        <w:pStyle w:val="ListBullet"/>
+      </w:pPr>
+      <w:r>
+        <w:t>OCR binary missing -&gt; pytesseract cannot run. Recovery: install Tesseract and set correct executable path.</w:t>
+      </w:r>
+    </w:p>
+    <w:p>
+      <w:pPr>
+        <w:pStyle w:val="ListBullet"/>
+      </w:pPr>
+      <w:r>
+        <w:t>Multiple server processes on same port -&gt; stale output seen. Recovery: terminate duplicate PIDs and restart one clean server.</w:t>
+      </w:r>
+    </w:p>
+    <w:p>
+      <w:pPr>
+        <w:pStyle w:val="Heading1"/>
+      </w:pPr>
+      <w:r>
+        <w:t>G. Security Discussion (What to answer beyond basics)</w:t>
+      </w:r>
+    </w:p>
+    <w:p>
+      <w:pPr>
+        <w:pStyle w:val="ListBullet"/>
+      </w:pPr>
+      <w:r>
+        <w:t>Implemented security: hashed passwords, route auth checks, secure filenames, restricted file types.</w:t>
+      </w:r>
+    </w:p>
+    <w:p>
+      <w:pPr>
+        <w:pStyle w:val="ListBullet"/>
+      </w:pPr>
+      <w:r>
+        <w:t>Known gap: app.secret_key is hardcoded; should move to environment variable.</w:t>
+      </w:r>
+    </w:p>
+    <w:p>
+      <w:pPr>
+        <w:pStyle w:val="ListBullet"/>
+      </w:pPr>
+      <w:r>
+        <w:t>Known gap: no CSRF token enforcement on forms currently.</w:t>
+      </w:r>
+    </w:p>
+    <w:p>
+      <w:pPr>
+        <w:pStyle w:val="ListBullet"/>
+      </w:pPr>
+      <w:r>
+        <w:t>Known gap: no strict file content validation beyond extension check.</w:t>
+      </w:r>
+    </w:p>
+    <w:p>
+      <w:pPr>
+        <w:pStyle w:val="ListBullet"/>
+      </w:pPr>
+      <w:r>
+        <w:t>Known gap: no request throttling/rate limiting for heavy generation endpoints.</w:t>
+      </w:r>
+    </w:p>
+    <w:p>
+      <w:r>
+        <w:rPr>
+          <w:b/>
+        </w:rPr>
+        <w:t>How to present maturity:</w:t>
       </w:r>
     </w:p>
     <w:p>
@@ -327,15 +985,15 @@
         <w:rPr>
           <w:b w:val="0"/>
         </w:rPr>
-        <w:t>I am accountable for end-to-end route flow, authentication gates, request validation, and system orchestration between UI, extractor, AI, and database layers.</w:t>
+        <w:t>Mention that current version is a functional academic prototype, and list production hardening steps (CSRF, secret rotation, async queue, structured logs, stronger validation).</w:t>
       </w:r>
     </w:p>
     <w:p>
+      <w:pPr>
+        <w:pStyle w:val="Heading1"/>
+      </w:pPr>
       <w:r>
-        <w:rPr>
-          <w:b/>
-        </w:rPr>
-        <w:t>Role 2: AI Integration and Prompt Engineer</w:t>
+        <w:t>H. Performance and Scalability Discussion</w:t>
       </w:r>
     </w:p>
     <w:p>
@@ -343,7 +1001,7 @@
         <w:pStyle w:val="ListBullet"/>
       </w:pPr>
       <w:r>
-        <w:t>Primary ownership: ai_generator.py.</w:t>
+        <w:t>Current bottlenecks: OCR latency, AI API round-trip latency, synchronous request blocking.</w:t>
       </w:r>
     </w:p>
     <w:p>
@@ -351,7 +1009,7 @@
         <w:pStyle w:val="ListBullet"/>
       </w:pPr>
       <w:r>
-        <w:t>Creates Groq client using GROQ_API_KEY from environment.</w:t>
+        <w:t>Scaling plan: move AI generation to background workers (Celery/RQ), queue requests, add status polling.</w:t>
       </w:r>
     </w:p>
     <w:p>
@@ -359,7 +1017,7 @@
         <w:pStyle w:val="ListBullet"/>
       </w:pPr>
       <w:r>
-        <w:t>Defines two generators: generate_quiz() and generate_flashcards().</w:t>
+        <w:t>DB scaling plan: migrate SQLite to PostgreSQL; add indexes on user_id and created_at.</w:t>
       </w:r>
     </w:p>
     <w:p>
@@ -367,23 +1025,23 @@
         <w:pStyle w:val="ListBullet"/>
       </w:pPr>
       <w:r>
-        <w:t>Uses strict prompt instructions to force JSON output only.</w:t>
+        <w:t>Caching opportunity: cache extracted text hash to avoid reprocessing same files.</w:t>
       </w:r>
     </w:p>
     <w:p>
       <w:pPr>
-        <w:pStyle w:val="ListBullet"/>
+        <w:pStyle w:val="Heading1"/>
       </w:pPr>
       <w:r>
-        <w:t>Cleans markdown fences from model output and parses JSON.</w:t>
+        <w:t>I. Detailed Demo Script (Team order)</w:t>
       </w:r>
     </w:p>
     <w:p>
+      <w:pPr>
+        <w:pStyle w:val="ListBullet"/>
+      </w:pPr>
       <w:r>
-        <w:rPr>
-          <w:b/>
-        </w:rPr>
-        <w:t>Role 2 - Viva Questions and Answers</w:t>
+        <w:t>Member 1: Introduce architecture and auth flow.</w:t>
       </w:r>
     </w:p>
     <w:p>
@@ -391,7 +1049,7 @@
         <w:pStyle w:val="ListBullet"/>
       </w:pPr>
       <w:r>
-        <w:t>Q: Which model is used? A: llama-3.3-70b-versatile via Groq.</w:t>
+        <w:t>Member 3: Show file upload and extraction explanation.</w:t>
       </w:r>
     </w:p>
     <w:p>
@@ -399,7 +1057,7 @@
         <w:pStyle w:val="ListBullet"/>
       </w:pPr>
       <w:r>
-        <w:t>Q: How is output format controlled? A: Prompt explicitly demands valid JSON array only.</w:t>
+        <w:t>Member 2: Explain AI prompt, generation, and output format.</w:t>
       </w:r>
     </w:p>
     <w:p>
@@ -407,7 +1065,7 @@
         <w:pStyle w:val="ListBullet"/>
       </w:pPr>
       <w:r>
-        <w:t>Q: Why strip ```json blocks? A: Models sometimes return fenced output; cleanup ensures json.loads works.</w:t>
+        <w:t>Member 4: Show saved results, score update, history, and delete flow.</w:t>
       </w:r>
     </w:p>
     <w:p>
@@ -415,39 +1073,39 @@
         <w:pStyle w:val="ListBullet"/>
       </w:pPr>
       <w:r>
-        <w:t>Q: What if API key is missing? A: Groq client throws initialization error; key must be set in .env.</w:t>
+        <w:t>All: conclude with limitations and future enhancements.</w:t>
       </w:r>
     </w:p>
     <w:p>
       <w:pPr>
-        <w:pStyle w:val="ListBullet"/>
+        <w:pStyle w:val="Heading1"/>
       </w:pPr>
       <w:r>
-        <w:t>Q: How many tokens/temperature are used? A: max_tokens=4000, temperature=0.7 for balanced creativity and relevance.</w:t>
+        <w:t>J. Long-form Viva Questions with Detailed Answers</w:t>
       </w:r>
     </w:p>
     <w:p>
+      <w:pPr>
+        <w:pStyle w:val="ListBullet"/>
+      </w:pPr>
       <w:r>
-        <w:rPr>
-          <w:b/>
-        </w:rPr>
-        <w:t>Role 2 - Accountability statement:</w:t>
+        <w:t>Q: Explain complete flow from upload to display with internal functions. A: /process receives mode and file, validates extension through allowed_file, stores file with secure_filename, extracts text via extractor.py based on extension, checks minimum length for quality, invokes AI generation function according to mode, stores JSON output in DB linked to current session user_id, removes temporary uploaded file, then redirects to result route that loads persisted JSON and renders templates.</w:t>
       </w:r>
     </w:p>
     <w:p>
+      <w:pPr>
+        <w:pStyle w:val="ListBullet"/>
+      </w:pPr>
       <w:r>
-        <w:rPr>
-          <w:b w:val="0"/>
-        </w:rPr>
-        <w:t>I am accountable for AI output quality, structured formatting, prompt design, and handling model response consistency.</w:t>
+        <w:t>Q: Why is modularization important here? A: Without modularization, app.py would be monolithic and hard to test/debug. By separating extraction, AI generation, and DB logic, each layer can be improved independently and role ownership becomes clear in team projects.</w:t>
       </w:r>
     </w:p>
     <w:p>
+      <w:pPr>
+        <w:pStyle w:val="ListBullet"/>
+      </w:pPr>
       <w:r>
-        <w:rPr>
-          <w:b/>
-        </w:rPr>
-        <w:t>Role 3: File Extraction and Input Pipeline Engineer</w:t>
+        <w:t>Q: What are ethical or academic concerns in AI-generated quizzes? A: Potential factual drift/hallucination if source text is weak. Mitigation is source-grounded prompts, stricter checks, and manual review for high-stakes usage.</w:t>
       </w:r>
     </w:p>
     <w:p>
@@ -455,7 +1113,7 @@
         <w:pStyle w:val="ListBullet"/>
       </w:pPr>
       <w:r>
-        <w:t>Primary ownership: extractor.py and upload processing logic in app.py.</w:t>
+        <w:t>Q: If internet goes down, what breaks and what still works? A: Registration/login/history and old content viewing continue (local DB). New quiz/flashcard generation fails because Groq API requires connectivity.</w:t>
       </w:r>
     </w:p>
     <w:p>
@@ -463,15 +1121,15 @@
         <w:pStyle w:val="ListBullet"/>
       </w:pPr>
       <w:r>
-        <w:t>Maps extension to extraction method: PDF, image OCR, DOCX, PPTX.</w:t>
+        <w:t>Q: How would you productionize this in 3 phases? A: Phase 1 security hardening (secret/env, CSRF, validation), Phase 2 reliability (error handling/retries/observability), Phase 3 scalability (async workers, PostgreSQL, deployment automation).</w:t>
       </w:r>
     </w:p>
     <w:p>
       <w:pPr>
-        <w:pStyle w:val="ListBullet"/>
+        <w:pStyle w:val="Heading1"/>
       </w:pPr>
       <w:r>
-        <w:t>Uses pdfplumber for text PDFs; pytesseract for images; python-docx and python-pptx for Office files.</w:t>
+        <w:t>K. Member-wise Final Accountability Statements</w:t>
       </w:r>
     </w:p>
     <w:p>
@@ -479,7 +1137,7 @@
         <w:pStyle w:val="ListBullet"/>
       </w:pPr>
       <w:r>
-        <w:t>Applies minimum extracted-text check before sending to AI.</w:t>
+        <w:t>Member 1 (Backend): accountable for routing correctness, session flow, and integration glue.</w:t>
       </w:r>
     </w:p>
     <w:p>
@@ -487,15 +1145,15 @@
         <w:pStyle w:val="ListBullet"/>
       </w:pPr>
       <w:r>
-        <w:t>Removes uploaded file after processing to reduce storage clutter.</w:t>
+        <w:t>Member 2 (AI): accountable for prompt quality, output structure, and generation reliability.</w:t>
       </w:r>
     </w:p>
     <w:p>
+      <w:pPr>
+        <w:pStyle w:val="ListBullet"/>
+      </w:pPr>
       <w:r>
-        <w:rPr>
-          <w:b/>
-        </w:rPr>
-        <w:t>Role 3 - Viva Questions and Answers</w:t>
+        <w:t>Member 3 (Extraction): accountable for robust text extraction and preprocessing quality.</w:t>
       </w:r>
     </w:p>
     <w:p>
@@ -503,15 +1161,15 @@
         <w:pStyle w:val="ListBullet"/>
       </w:pPr>
       <w:r>
-        <w:t>Q: Why is OCR needed? A: Image-based notes and scanned pages require OCR to convert visuals to text.</w:t>
+        <w:t>Member 4 (DB + UI): accountable for persistence integrity, user history, and frontend usability.</w:t>
       </w:r>
     </w:p>
     <w:p>
       <w:pPr>
-        <w:pStyle w:val="ListBullet"/>
+        <w:pStyle w:val="Heading1"/>
       </w:pPr>
       <w:r>
-        <w:t>Q: Where is Tesseract configured? A: extractor.py sets local Tesseract path.</w:t>
+        <w:t>L. Rapid Revision Sheet (Night-before)</w:t>
       </w:r>
     </w:p>
     <w:p>
@@ -519,7 +1177,7 @@
         <w:pStyle w:val="ListBullet"/>
       </w:pPr>
       <w:r>
-        <w:t>Q: How do you prevent unsupported uploads? A: allowed_file() validates extension against whitelist.</w:t>
+        <w:t>Know every major route and why it exists.</w:t>
       </w:r>
     </w:p>
     <w:p>
@@ -527,7 +1185,7 @@
         <w:pStyle w:val="ListBullet"/>
       </w:pPr>
       <w:r>
-        <w:t>Q: Why enforce min text length? A: To avoid poor AI output from insufficient input.</w:t>
+        <w:t>Know every table schema field and its purpose.</w:t>
       </w:r>
     </w:p>
     <w:p>
@@ -535,591 +1193,31 @@
         <w:pStyle w:val="ListBullet"/>
       </w:pPr>
       <w:r>
-        <w:t>Q: What are extraction failure scenarios? A: Corrupt file, image quality issues, empty scanned pages.</w:t>
+        <w:t>Know extraction path per file type and OCR dependency reason.</w:t>
       </w:r>
     </w:p>
     <w:p>
+      <w:pPr>
+        <w:pStyle w:val="ListBullet"/>
+      </w:pPr>
       <w:r>
-        <w:rPr>
-          <w:b/>
-        </w:rPr>
-        <w:t>Role 3 - Accountability statement:</w:t>
+        <w:t>Know AI prompt strategy and JSON parsing logic.</w:t>
       </w:r>
     </w:p>
     <w:p>
+      <w:pPr>
+        <w:pStyle w:val="ListBullet"/>
+      </w:pPr>
       <w:r>
-        <w:rPr>
-          <w:b w:val="0"/>
-        </w:rPr>
-        <w:t>I am accountable for robust file intake, text extraction accuracy, and data readiness before AI generation.</w:t>
+        <w:t>Know at least 5 limitations and 5 future improvements.</w:t>
       </w:r>
     </w:p>
     <w:p>
+      <w:pPr>
+        <w:pStyle w:val="ListBullet"/>
+      </w:pPr>
       <w:r>
-        <w:rPr>
-          <w:b/>
-        </w:rPr>
-        <w:t>Role 4: Database, Persistence, and Frontend UX Engineer</w:t>
-      </w:r>
-    </w:p>
-    <w:p>
-      <w:pPr>
-        <w:pStyle w:val="ListBullet"/>
-      </w:pPr>
-      <w:r>
-        <w:t>Primary ownership: database.py and templates/ user experience.</w:t>
-      </w:r>
-    </w:p>
-    <w:p>
-      <w:pPr>
-        <w:pStyle w:val="ListBullet"/>
-      </w:pPr>
-      <w:r>
-        <w:t>Database schema: users, saved_quizzes, saved_flashcards.</w:t>
-      </w:r>
-    </w:p>
-    <w:p>
-      <w:pPr>
-        <w:pStyle w:val="ListBullet"/>
-      </w:pPr>
-      <w:r>
-        <w:t>Stores generated content as JSON text blobs linked with user_id and timestamps.</w:t>
-      </w:r>
-    </w:p>
-    <w:p>
-      <w:pPr>
-        <w:pStyle w:val="ListBullet"/>
-      </w:pPr>
-      <w:r>
-        <w:t>Handles history listing, score updates, and delete actions.</w:t>
-      </w:r>
-    </w:p>
-    <w:p>
-      <w:pPr>
-        <w:pStyle w:val="ListBullet"/>
-      </w:pPr>
-      <w:r>
-        <w:t>Frontend pages: landing, auth pages, dashboard, upload, quiz, flashcards, history.</w:t>
-      </w:r>
-    </w:p>
-    <w:p>
-      <w:r>
-        <w:rPr>
-          <w:b/>
-        </w:rPr>
-        <w:t>Role 4 - Viva Questions and Answers</w:t>
-      </w:r>
-    </w:p>
-    <w:p>
-      <w:pPr>
-        <w:pStyle w:val="ListBullet"/>
-      </w:pPr>
-      <w:r>
-        <w:t>Q: Why SQLite? A: Lightweight and perfect for college project scope without separate DB server.</w:t>
-      </w:r>
-    </w:p>
-    <w:p>
-      <w:pPr>
-        <w:pStyle w:val="ListBullet"/>
-      </w:pPr>
-      <w:r>
-        <w:t>Q: How are passwords protected? A: Stored as hashed values, validated with check_password_hash.</w:t>
-      </w:r>
-    </w:p>
-    <w:p>
-      <w:pPr>
-        <w:pStyle w:val="ListBullet"/>
-      </w:pPr>
-      <w:r>
-        <w:t>Q: Why store quiz/cards as JSON text? A: Flexible schema for variable-length AI-generated content.</w:t>
-      </w:r>
-    </w:p>
-    <w:p>
-      <w:pPr>
-        <w:pStyle w:val="ListBullet"/>
-      </w:pPr>
-      <w:r>
-        <w:t>Q: How is score saved? A: /save_score endpoint updates saved_quizzes.score.</w:t>
-      </w:r>
-    </w:p>
-    <w:p>
-      <w:pPr>
-        <w:pStyle w:val="ListBullet"/>
-      </w:pPr>
-      <w:r>
-        <w:t>Q: How is user history personalized? A: Queries filter by current session user_id.</w:t>
-      </w:r>
-    </w:p>
-    <w:p>
-      <w:r>
-        <w:rPr>
-          <w:b/>
-        </w:rPr>
-        <w:t>Role 4 - Accountability statement:</w:t>
-      </w:r>
-    </w:p>
-    <w:p>
-      <w:r>
-        <w:rPr>
-          <w:b w:val="0"/>
-        </w:rPr>
-        <w:t>I am accountable for data persistence correctness, schema integrity, user history management, and UI clarity.</w:t>
-      </w:r>
-    </w:p>
-    <w:p>
-      <w:pPr>
-        <w:pStyle w:val="Heading1"/>
-      </w:pPr>
-      <w:r>
-        <w:t>5) Code-Level Walkthrough for Viva</w:t>
-      </w:r>
-    </w:p>
-    <w:p>
-      <w:r>
-        <w:rPr>
-          <w:b/>
-        </w:rPr>
-        <w:t>app.py (orchestration and routes):</w:t>
-      </w:r>
-    </w:p>
-    <w:p>
-      <w:pPr>
-        <w:pStyle w:val="ListBullet"/>
-      </w:pPr>
-      <w:r>
-        <w:t>Initializes Flask app, secret key, upload settings, and DB initialization.</w:t>
-      </w:r>
-    </w:p>
-    <w:p>
-      <w:pPr>
-        <w:pStyle w:val="ListBullet"/>
-      </w:pPr>
-      <w:r>
-        <w:t>Defines auth routes and session lifecycle.</w:t>
-      </w:r>
-    </w:p>
-    <w:p>
-      <w:pPr>
-        <w:pStyle w:val="ListBullet"/>
-      </w:pPr>
-      <w:r>
-        <w:t>Defines processing route that chains extraction + AI + DB save.</w:t>
-      </w:r>
-    </w:p>
-    <w:p>
-      <w:pPr>
-        <w:pStyle w:val="ListBullet"/>
-      </w:pPr>
-      <w:r>
-        <w:t>Serves generated content pages and history management.</w:t>
-      </w:r>
-    </w:p>
-    <w:p>
-      <w:r>
-        <w:rPr>
-          <w:b/>
-        </w:rPr>
-        <w:t>database.py (persistence layer):</w:t>
-      </w:r>
-    </w:p>
-    <w:p>
-      <w:pPr>
-        <w:pStyle w:val="ListBullet"/>
-      </w:pPr>
-      <w:r>
-        <w:t>Provides CRUD methods using sqlite3 with row_factory for dict-like access.</w:t>
-      </w:r>
-    </w:p>
-    <w:p>
-      <w:pPr>
-        <w:pStyle w:val="ListBullet"/>
-      </w:pPr>
-      <w:r>
-        <w:t>Creates tables if not present at startup.</w:t>
-      </w:r>
-    </w:p>
-    <w:p>
-      <w:pPr>
-        <w:pStyle w:val="ListBullet"/>
-      </w:pPr>
-      <w:r>
-        <w:t>Serializes questions/cards using json.dumps before storing.</w:t>
-      </w:r>
-    </w:p>
-    <w:p>
-      <w:r>
-        <w:rPr>
-          <w:b/>
-        </w:rPr>
-        <w:t>extractor.py (input text conversion):</w:t>
-      </w:r>
-    </w:p>
-    <w:p>
-      <w:pPr>
-        <w:pStyle w:val="ListBullet"/>
-      </w:pPr>
-      <w:r>
-        <w:t>Chooses extraction function by extension.</w:t>
-      </w:r>
-    </w:p>
-    <w:p>
-      <w:pPr>
-        <w:pStyle w:val="ListBullet"/>
-      </w:pPr>
-      <w:r>
-        <w:t>Converts each supported format to plain text string consumed by AI.</w:t>
-      </w:r>
-    </w:p>
-    <w:p>
-      <w:r>
-        <w:rPr>
-          <w:b/>
-        </w:rPr>
-        <w:t>ai_generator.py (generation layer):</w:t>
-      </w:r>
-    </w:p>
-    <w:p>
-      <w:pPr>
-        <w:pStyle w:val="ListBullet"/>
-      </w:pPr>
-      <w:r>
-        <w:t>Loads GROQ_API_KEY from .env.</w:t>
-      </w:r>
-    </w:p>
-    <w:p>
-      <w:pPr>
-        <w:pStyle w:val="ListBullet"/>
-      </w:pPr>
-      <w:r>
-        <w:t>Builds explicit generation prompts with strict output schema.</w:t>
-      </w:r>
-    </w:p>
-    <w:p>
-      <w:pPr>
-        <w:pStyle w:val="ListBullet"/>
-      </w:pPr>
-      <w:r>
-        <w:t>Parses and returns Python list objects to app.py.</w:t>
-      </w:r>
-    </w:p>
-    <w:p>
-      <w:pPr>
-        <w:pStyle w:val="Heading1"/>
-      </w:pPr>
-      <w:r>
-        <w:t>6) Security, Reliability, and Limitations</w:t>
-      </w:r>
-    </w:p>
-    <w:p>
-      <w:pPr>
-        <w:pStyle w:val="ListBullet"/>
-      </w:pPr>
-      <w:r>
-        <w:t>Implemented: password hashing, input extension checks, auth-protected routes.</w:t>
-      </w:r>
-    </w:p>
-    <w:p>
-      <w:pPr>
-        <w:pStyle w:val="ListBullet"/>
-      </w:pPr>
-      <w:r>
-        <w:t>Current risk: app.secret_key is hardcoded and should be moved to environment variable.</w:t>
-      </w:r>
-    </w:p>
-    <w:p>
-      <w:pPr>
-        <w:pStyle w:val="ListBullet"/>
-      </w:pPr>
-      <w:r>
-        <w:t>Current risk: AI JSON parse may fail if model output deviates; try/except fallback can be improved.</w:t>
-      </w:r>
-    </w:p>
-    <w:p>
-      <w:pPr>
-        <w:pStyle w:val="ListBullet"/>
-      </w:pPr>
-      <w:r>
-        <w:t>Current risk: SQLite is single-file DB and not ideal for high concurrency production use.</w:t>
-      </w:r>
-    </w:p>
-    <w:p>
-      <w:pPr>
-        <w:pStyle w:val="ListBullet"/>
-      </w:pPr>
-      <w:r>
-        <w:t>Current risk: OCR quality depends on image quality and local Tesseract setup.</w:t>
-      </w:r>
-    </w:p>
-    <w:p>
-      <w:pPr>
-        <w:pStyle w:val="Heading1"/>
-      </w:pPr>
-      <w:r>
-        <w:t>7) Testing and Demo Plan (Presentation sequence)</w:t>
-      </w:r>
-    </w:p>
-    <w:p>
-      <w:pPr>
-        <w:pStyle w:val="ListBullet"/>
-      </w:pPr>
-      <w:r>
-        <w:t>Demo 1: Register new user and login.</w:t>
-      </w:r>
-    </w:p>
-    <w:p>
-      <w:pPr>
-        <w:pStyle w:val="ListBullet"/>
-      </w:pPr>
-      <w:r>
-        <w:t>Demo 2: Choose quiz mode and upload sample PDF.</w:t>
-      </w:r>
-    </w:p>
-    <w:p>
-      <w:pPr>
-        <w:pStyle w:val="ListBullet"/>
-      </w:pPr>
-      <w:r>
-        <w:t>Demo 3: Show generated quiz and attempt questions.</w:t>
-      </w:r>
-    </w:p>
-    <w:p>
-      <w:pPr>
-        <w:pStyle w:val="ListBullet"/>
-      </w:pPr>
-      <w:r>
-        <w:t>Demo 4: Save score and verify in history.</w:t>
-      </w:r>
-    </w:p>
-    <w:p>
-      <w:pPr>
-        <w:pStyle w:val="ListBullet"/>
-      </w:pPr>
-      <w:r>
-        <w:t>Demo 5: Generate flashcards from another file and show review mode.</w:t>
-      </w:r>
-    </w:p>
-    <w:p>
-      <w:pPr>
-        <w:pStyle w:val="ListBullet"/>
-      </w:pPr>
-      <w:r>
-        <w:t>Demo 6: Delete one history item to show data control.</w:t>
-      </w:r>
-    </w:p>
-    <w:p>
-      <w:pPr>
-        <w:pStyle w:val="Heading1"/>
-      </w:pPr>
-      <w:r>
-        <w:t>8) Common Viva Questions (Project-wide) with Model Answers</w:t>
-      </w:r>
-    </w:p>
-    <w:p>
-      <w:pPr>
-        <w:pStyle w:val="ListBullet"/>
-      </w:pPr>
-      <w:r>
-        <w:t>Q: What real problem does this solve? A: It converts static notes into active learning materials instantly.</w:t>
-      </w:r>
-    </w:p>
-    <w:p>
-      <w:pPr>
-        <w:pStyle w:val="ListBullet"/>
-      </w:pPr>
-      <w:r>
-        <w:t>Q: Where is AI used exactly? A: In content generation only, after extracting file text.</w:t>
-      </w:r>
-    </w:p>
-    <w:p>
-      <w:pPr>
-        <w:pStyle w:val="ListBullet"/>
-      </w:pPr>
-      <w:r>
-        <w:t>Q: How do components communicate? A: Flask routes call extractor and AI modules, then persist via database module.</w:t>
-      </w:r>
-    </w:p>
-    <w:p>
-      <w:pPr>
-        <w:pStyle w:val="ListBullet"/>
-      </w:pPr>
-      <w:r>
-        <w:t>Q: How do you ensure user-specific data isolation? A: Data queries are filtered by logged-in user_id from session.</w:t>
-      </w:r>
-    </w:p>
-    <w:p>
-      <w:pPr>
-        <w:pStyle w:val="ListBullet"/>
-      </w:pPr>
-      <w:r>
-        <w:t>Q: Can this be scaled? A: Yes, by moving to Postgres, adding async task queue, and stronger validation layers.</w:t>
-      </w:r>
-    </w:p>
-    <w:p>
-      <w:pPr>
-        <w:pStyle w:val="Heading1"/>
-      </w:pPr>
-      <w:r>
-        <w:t>9) Individual Speaking Script (1 minute each)</w:t>
-      </w:r>
-    </w:p>
-    <w:p>
-      <w:r>
-        <w:rPr>
-          <w:b/>
-        </w:rPr>
-        <w:t>Member 1 script (Backend):</w:t>
-      </w:r>
-    </w:p>
-    <w:p>
-      <w:r>
-        <w:rPr>
-          <w:b w:val="0"/>
-        </w:rPr>
-        <w:t>I designed the Flask backend flow in app.py. I handled routes, authentication, session management, protected endpoints, and end-to-end integration from upload to generated output display.</w:t>
-      </w:r>
-    </w:p>
-    <w:p>
-      <w:r>
-        <w:rPr>
-          <w:b/>
-        </w:rPr>
-        <w:t>Member 2 script (AI):</w:t>
-      </w:r>
-    </w:p>
-    <w:p>
-      <w:r>
-        <w:rPr>
-          <w:b w:val="0"/>
-        </w:rPr>
-        <w:t>I built the AI generation layer. I integrated Groq API, wrote prompt templates for quizzes and flashcards, and enforced JSON-structured responses for direct storage and rendering.</w:t>
-      </w:r>
-    </w:p>
-    <w:p>
-      <w:r>
-        <w:rPr>
-          <w:b/>
-        </w:rPr>
-        <w:t>Member 3 script (Extraction):</w:t>
-      </w:r>
-    </w:p>
-    <w:p>
-      <w:r>
-        <w:rPr>
-          <w:b w:val="0"/>
-        </w:rPr>
-        <w:t>I implemented the file extraction pipeline for PDF, images, DOCX, and PPTX. I ensured clean text is extracted and validated before AI processing to maintain output quality.</w:t>
-      </w:r>
-    </w:p>
-    <w:p>
-      <w:r>
-        <w:rPr>
-          <w:b/>
-        </w:rPr>
-        <w:t>Member 4 script (Database + UI):</w:t>
-      </w:r>
-    </w:p>
-    <w:p>
-      <w:r>
-        <w:rPr>
-          <w:b w:val="0"/>
-        </w:rPr>
-        <w:t>I handled database schema and persistence along with frontend page flows. I implemented history, score storage, and user-oriented pages to make the app usable end-to-end.</w:t>
-      </w:r>
-    </w:p>
-    <w:p>
-      <w:pPr>
-        <w:pStyle w:val="Heading1"/>
-      </w:pPr>
-      <w:r>
-        <w:t>10) Future Improvements (for high marks)</w:t>
-      </w:r>
-    </w:p>
-    <w:p>
-      <w:pPr>
-        <w:pStyle w:val="ListBullet"/>
-      </w:pPr>
-      <w:r>
-        <w:t>Move secret keys to environment variables and rotate keys.</w:t>
-      </w:r>
-    </w:p>
-    <w:p>
-      <w:pPr>
-        <w:pStyle w:val="ListBullet"/>
-      </w:pPr>
-      <w:r>
-        <w:t>Add robust exception handling and retry logic around AI calls.</w:t>
-      </w:r>
-    </w:p>
-    <w:p>
-      <w:pPr>
-        <w:pStyle w:val="ListBullet"/>
-      </w:pPr>
-      <w:r>
-        <w:t>Implement CSRF protection and stronger input validation.</w:t>
-      </w:r>
-    </w:p>
-    <w:p>
-      <w:pPr>
-        <w:pStyle w:val="ListBullet"/>
-      </w:pPr>
-      <w:r>
-        <w:t>Introduce unit/integration tests for routes and services.</w:t>
-      </w:r>
-    </w:p>
-    <w:p>
-      <w:pPr>
-        <w:pStyle w:val="ListBullet"/>
-      </w:pPr>
-      <w:r>
-        <w:t>Use PostgreSQL and cloud deployment for production readiness.</w:t>
-      </w:r>
-    </w:p>
-    <w:p>
-      <w:pPr>
-        <w:pStyle w:val="ListBullet"/>
-      </w:pPr>
-      <w:r>
-        <w:t>Add analytics dashboard for learning performance trends.</w:t>
-      </w:r>
-    </w:p>
-    <w:p>
-      <w:pPr>
-        <w:pStyle w:val="Heading1"/>
-      </w:pPr>
-      <w:r>
-        <w:t>11) Quick Responsibility Checklist</w:t>
-      </w:r>
-    </w:p>
-    <w:p>
-      <w:pPr>
-        <w:pStyle w:val="ListBullet"/>
-      </w:pPr>
-      <w:r>
-        <w:t>Member 1: Own complete route map and authentication flow explanations.</w:t>
-      </w:r>
-    </w:p>
-    <w:p>
-      <w:pPr>
-        <w:pStyle w:val="ListBullet"/>
-      </w:pPr>
-      <w:r>
-        <w:t>Member 2: Own AI prompts, output schema, and model behavior answers.</w:t>
-      </w:r>
-    </w:p>
-    <w:p>
-      <w:pPr>
-        <w:pStyle w:val="ListBullet"/>
-      </w:pPr>
-      <w:r>
-        <w:t>Member 3: Own extraction logic, file support matrix, and preprocessing rationale.</w:t>
-      </w:r>
-    </w:p>
-    <w:p>
-      <w:pPr>
-        <w:pStyle w:val="ListBullet"/>
-      </w:pPr>
-      <w:r>
-        <w:t>Member 4: Own DB schema, persistence behavior, and UI demonstration narrative.</w:t>
+        <w:t>Know who answers what in team presentation.</w:t>
       </w:r>
     </w:p>
     <w:sectPr>

</xml_diff>

<commit_message>
Polish README and simplify viva handbook.
Add beginner-friendly setup/docs and rewrite handbook in easy language with detailed role-wise answers.

Made-with: Cursor
</commit_message>
<xml_diff>
--- a/QuizForge_Viva_Rolewise_Handbook.docx
+++ b/QuizForge_Viva_Rolewise_Handbook.docx
@@ -7,7 +7,7 @@
         <w:pStyle w:val="Title"/>
       </w:pPr>
       <w:r>
-        <w:t>QuizForge - Detailed Viva Rolewise Handbook</w:t>
+        <w:t>QuizForge Viva Handbook (Easy Language + Detailed Answers)</w:t>
       </w:r>
     </w:p>
     <w:p>
@@ -15,7 +15,15 @@
         <w:rPr>
           <w:b w:val="0"/>
         </w:rPr>
-        <w:t>This document is a deep viva preparation guide with role ownership, internal code logic, design rationale, edge cases, and detailed model answers.</w:t>
+        <w:t>This file is made for students who are new to the project. Language is simple, but answers are detailed enough for viva.</w:t>
+      </w:r>
+    </w:p>
+    <w:p>
+      <w:pPr>
+        <w:pStyle w:val="Heading1"/>
+      </w:pPr>
+      <w:r>
+        <w:t>1) Project in Very Simple Words</w:t>
       </w:r>
     </w:p>
     <w:p>
@@ -23,7 +31,47 @@
         <w:rPr>
           <w:b w:val="0"/>
         </w:rPr>
-        <w:t>Project Theme: AI powered automatic quiz and flashcard generation from uploaded academic content.</w:t>
+        <w:t>QuizForge is a web app that turns study material into quizzes and flashcards automatically using AI.</w:t>
+      </w:r>
+    </w:p>
+    <w:p>
+      <w:pPr>
+        <w:pStyle w:val="ListBullet"/>
+      </w:pPr>
+      <w:r>
+        <w:t>You upload notes (PDF/image/DOCX/PPTX).</w:t>
+      </w:r>
+    </w:p>
+    <w:p>
+      <w:pPr>
+        <w:pStyle w:val="ListBullet"/>
+      </w:pPr>
+      <w:r>
+        <w:t>App reads text from file.</w:t>
+      </w:r>
+    </w:p>
+    <w:p>
+      <w:pPr>
+        <w:pStyle w:val="ListBullet"/>
+      </w:pPr>
+      <w:r>
+        <w:t>AI creates quiz or flashcards.</w:t>
+      </w:r>
+    </w:p>
+    <w:p>
+      <w:pPr>
+        <w:pStyle w:val="ListBullet"/>
+      </w:pPr>
+      <w:r>
+        <w:t>App saves result for that user.</w:t>
+      </w:r>
+    </w:p>
+    <w:p>
+      <w:pPr>
+        <w:pStyle w:val="ListBullet"/>
+      </w:pPr>
+      <w:r>
+        <w:t>User can practice and check history later.</w:t>
       </w:r>
     </w:p>
     <w:p>
@@ -31,7 +79,7 @@
         <w:pStyle w:val="Heading1"/>
       </w:pPr>
       <w:r>
-        <w:t>A. Executive Summary</w:t>
+        <w:t>2) What Happens Inside (Step by Step)</w:t>
       </w:r>
     </w:p>
     <w:p>
@@ -39,7 +87,7 @@
         <w:pStyle w:val="ListBullet"/>
       </w:pPr>
       <w:r>
-        <w:t>QuizForge is a Flask-based full-stack project that transforms passive study material into active recall tools.</w:t>
+        <w:t>Step 1: User opens app and logs in.</w:t>
       </w:r>
     </w:p>
     <w:p>
@@ -47,7 +95,7 @@
         <w:pStyle w:val="ListBullet"/>
       </w:pPr>
       <w:r>
-        <w:t>Users upload files (PDF/image/DOCX/PPTX), text is extracted, AI generates structured content, and outputs are saved user-wise.</w:t>
+        <w:t>Step 2: User chooses Quiz mode or Flashcard mode.</w:t>
       </w:r>
     </w:p>
     <w:p>
@@ -55,7 +103,7 @@
         <w:pStyle w:val="ListBullet"/>
       </w:pPr>
       <w:r>
-        <w:t>The application includes authentication, content generation, score tracking, and history management.</w:t>
+        <w:t>Step 3: User uploads file.</w:t>
       </w:r>
     </w:p>
     <w:p>
@@ -63,7 +111,47 @@
         <w:pStyle w:val="ListBullet"/>
       </w:pPr>
       <w:r>
-        <w:t>Core architecture follows a modular separation: route layer, extraction layer, AI layer, and persistence layer.</w:t>
+        <w:t>Step 4: Flask route /process validates file.</w:t>
+      </w:r>
+    </w:p>
+    <w:p>
+      <w:pPr>
+        <w:pStyle w:val="ListBullet"/>
+      </w:pPr>
+      <w:r>
+        <w:t>Step 5: extractor.py reads text from file.</w:t>
+      </w:r>
+    </w:p>
+    <w:p>
+      <w:pPr>
+        <w:pStyle w:val="ListBullet"/>
+      </w:pPr>
+      <w:r>
+        <w:t>Step 6: ai_generator.py sends text to Groq model.</w:t>
+      </w:r>
+    </w:p>
+    <w:p>
+      <w:pPr>
+        <w:pStyle w:val="ListBullet"/>
+      </w:pPr>
+      <w:r>
+        <w:t>Step 7: Model returns JSON questions/cards.</w:t>
+      </w:r>
+    </w:p>
+    <w:p>
+      <w:pPr>
+        <w:pStyle w:val="ListBullet"/>
+      </w:pPr>
+      <w:r>
+        <w:t>Step 8: database.py stores data in SQLite.</w:t>
+      </w:r>
+    </w:p>
+    <w:p>
+      <w:pPr>
+        <w:pStyle w:val="ListBullet"/>
+      </w:pPr>
+      <w:r>
+        <w:t>Step 9: App opens quiz/flashcard page for user.</w:t>
       </w:r>
     </w:p>
     <w:p>
@@ -71,7 +159,15 @@
         <w:pStyle w:val="Heading1"/>
       </w:pPr>
       <w:r>
-        <w:t>B. Detailed Architecture</w:t>
+        <w:t>3) Role Division for 4 Members (With Accountability)</w:t>
+      </w:r>
+    </w:p>
+    <w:p>
+      <w:pPr>
+        <w:pStyle w:val="Heading2"/>
+      </w:pPr>
+      <w:r>
+        <w:t>Role 1 - Backend Flow Owner (app.py)</w:t>
       </w:r>
     </w:p>
     <w:p>
@@ -79,7 +175,7 @@
         <w:pStyle w:val="ListBullet"/>
       </w:pPr>
       <w:r>
-        <w:t>Presentation Layer: HTML templates in templates/ directory.</w:t>
+        <w:t>Own all routes and app flow.</w:t>
       </w:r>
     </w:p>
     <w:p>
@@ -87,7 +183,7 @@
         <w:pStyle w:val="ListBullet"/>
       </w:pPr>
       <w:r>
-        <w:t>Application Layer: app.py manages endpoints, session control, and orchestration.</w:t>
+        <w:t>Explain login/register/logout/session logic.</w:t>
       </w:r>
     </w:p>
     <w:p>
@@ -95,7 +191,7 @@
         <w:pStyle w:val="ListBullet"/>
       </w:pPr>
       <w:r>
-        <w:t>Service Layer: extractor.py (content ingestion) and ai_generator.py (LLM generation).</w:t>
+        <w:t>Explain /process route (main pipeline).</w:t>
       </w:r>
     </w:p>
     <w:p>
@@ -103,15 +199,7 @@
         <w:pStyle w:val="ListBullet"/>
       </w:pPr>
       <w:r>
-        <w:t>Data Layer: database.py wraps SQLite operations with helper functions.</w:t>
-      </w:r>
-    </w:p>
-    <w:p>
-      <w:pPr>
-        <w:pStyle w:val="ListBullet"/>
-      </w:pPr>
-      <w:r>
-        <w:t>Configuration Layer: .env for GROQ_API_KEY and runtime defaults.</w:t>
+        <w:t>Answer all flow and validation questions.</w:t>
       </w:r>
     </w:p>
     <w:p>
@@ -119,71 +207,7 @@
         <w:rPr>
           <w:b/>
         </w:rPr>
-        <w:t>Request lifecycle in one line:</w:t>
-      </w:r>
-    </w:p>
-    <w:p>
-      <w:r>
-        <w:rPr>
-          <w:b w:val="0"/>
-        </w:rPr>
-        <w:t>Browser -&gt; Flask route -&gt; validation -&gt; extractor -&gt; AI generator -&gt; DB write -&gt; template render/redirect -&gt; browser response.</w:t>
-      </w:r>
-    </w:p>
-    <w:p>
-      <w:pPr>
-        <w:pStyle w:val="Heading1"/>
-      </w:pPr>
-      <w:r>
-        <w:t>C. Role Distribution with Deep Technical Ownership</w:t>
-      </w:r>
-    </w:p>
-    <w:p>
-      <w:pPr>
-        <w:pStyle w:val="Heading2"/>
-      </w:pPr>
-      <w:r>
-        <w:t>Role 1 - Backend and Routing Engineer</w:t>
-      </w:r>
-    </w:p>
-    <w:p>
-      <w:pPr>
-        <w:pStyle w:val="ListBullet"/>
-      </w:pPr>
-      <w:r>
-        <w:t>Owns app.py route map, control flow, session state, and integration sequence.</w:t>
-      </w:r>
-    </w:p>
-    <w:p>
-      <w:pPr>
-        <w:pStyle w:val="ListBullet"/>
-      </w:pPr>
-      <w:r>
-        <w:t>Handles route-level validation and user navigation coherence.</w:t>
-      </w:r>
-    </w:p>
-    <w:p>
-      <w:pPr>
-        <w:pStyle w:val="ListBullet"/>
-      </w:pPr>
-      <w:r>
-        <w:t>Guarantees protected endpoints are accessible only after authentication.</w:t>
-      </w:r>
-    </w:p>
-    <w:p>
-      <w:pPr>
-        <w:pStyle w:val="ListBullet"/>
-      </w:pPr>
-      <w:r>
-        <w:t>Responsible for converting service outputs into user-facing pages.</w:t>
-      </w:r>
-    </w:p>
-    <w:p>
-      <w:r>
-        <w:rPr>
-          <w:b/>
-        </w:rPr>
-        <w:t>Important code logic snippets to explain:</w:t>
+        <w:t>Important logic you should remember:</w:t>
       </w:r>
     </w:p>
     <w:p>
@@ -219,7 +243,7 @@
           <w:rFonts w:ascii="Consolas" w:hAnsi="Consolas"/>
           <w:sz w:val="20"/>
         </w:rPr>
-        <w:t>if not allowed_file(file.filename): return render_template('upload.html', error='File type not supported.')</w:t>
+        <w:t>if not allowed_file(file.filename): show error</w:t>
       </w:r>
     </w:p>
     <w:p>
@@ -237,7 +261,7 @@
           <w:rFonts w:ascii="Consolas" w:hAnsi="Consolas"/>
           <w:sz w:val="20"/>
         </w:rPr>
-        <w:t>if len(text.strip()) &lt; 100: return render_template('upload.html', error='Could not extract enough text.')</w:t>
+        <w:t>if mode == 'quiz': generate_quiz(...)</w:t>
       </w:r>
     </w:p>
     <w:p>
@@ -246,16 +270,7 @@
           <w:rFonts w:ascii="Consolas" w:hAnsi="Consolas"/>
           <w:sz w:val="20"/>
         </w:rPr>
-        <w:t>if mode == 'quiz': questions = generate_quiz(text, num_questions=num)</w:t>
-      </w:r>
-    </w:p>
-    <w:p>
-      <w:r>
-        <w:rPr>
-          <w:rFonts w:ascii="Consolas" w:hAnsi="Consolas"/>
-          <w:sz w:val="20"/>
-        </w:rPr>
-        <w:t>elif mode == 'flash': cards = generate_flashcards(text, num_cards=num)</w:t>
+        <w:t>elif mode == 'flash': generate_flashcards(...)</w:t>
       </w:r>
     </w:p>
     <w:p>
@@ -263,7 +278,7 @@
         <w:rPr>
           <w:b/>
         </w:rPr>
-        <w:t>Detailed viva Q&amp;A for Role 1:</w:t>
+        <w:t>Detailed viva Q&amp;A (Role 1):</w:t>
       </w:r>
     </w:p>
     <w:p>
@@ -271,7 +286,7 @@
         <w:pStyle w:val="ListBullet"/>
       </w:pPr>
       <w:r>
-        <w:t>Q: Why did you create login_required decorator instead of repeating checks in each route? A: To centralize authentication policy, reduce code duplication, and avoid missing access checks accidentally. It applies single-point security enforcement to protected routes like /dashboard, /upload, /process, /history.</w:t>
+        <w:t>Q: Why use Flask? A: Flask is lightweight and simple. For college projects it is fast to build and easy to explain. We can clearly map each feature to one route.</w:t>
       </w:r>
     </w:p>
     <w:p>
@@ -279,7 +294,7 @@
         <w:pStyle w:val="ListBullet"/>
       </w:pPr>
       <w:r>
-        <w:t>Q: Why redirect after successful form submissions? A: We follow Post/Redirect/Get style to prevent duplicate resubmission on browser refresh and to provide clean URL transitions.</w:t>
+        <w:t>Q: What does login_required do? A: It protects private pages. If user is not logged in, route sends them to login page. This prevents unauthorized access to dashboard/history.</w:t>
       </w:r>
     </w:p>
     <w:p>
@@ -287,7 +302,7 @@
         <w:pStyle w:val="ListBullet"/>
       </w:pPr>
       <w:r>
-        <w:t>Q: Why use secure_filename on uploads? A: Uploaded filenames may contain path traversal sequences or special characters. secure_filename normalizes the name and protects filesystem writes.</w:t>
+        <w:t>Q: Why secure_filename? A: User-uploaded names can be unsafe. secure_filename removes dangerous characters and reduces path-related risks.</w:t>
       </w:r>
     </w:p>
     <w:p>
@@ -295,7 +310,7 @@
         <w:pStyle w:val="ListBullet"/>
       </w:pPr>
       <w:r>
-        <w:t>Q: What is the purpose of mode in /upload/&lt;mode&gt; and /process? A: mode acts as a strategy selector that determines whether the same upload pipeline should call quiz generation or flashcard generation.</w:t>
+        <w:t>Q: Why use redirect after success? A: To move user cleanly to next page and avoid form resubmission problems on refresh.</w:t>
       </w:r>
     </w:p>
     <w:p>
@@ -303,7 +318,23 @@
         <w:pStyle w:val="ListBullet"/>
       </w:pPr>
       <w:r>
-        <w:t>Q: If generation fails in production, where would you add handling? A: Around extraction and AI calls in /process, using try/except, logging, and user-safe error messages with retry guidance.</w:t>
+        <w:t>Q: What is the most important route? A: /process, because this route connects upload, extraction, AI, database save, and final output page.</w:t>
+      </w:r>
+    </w:p>
+    <w:p>
+      <w:r>
+        <w:rPr>
+          <w:b/>
+        </w:rPr>
+        <w:t>What this member should say in presentation:</w:t>
+      </w:r>
+    </w:p>
+    <w:p>
+      <w:r>
+        <w:rPr>
+          <w:b w:val="0"/>
+        </w:rPr>
+        <w:t>I handled backend flow. I connected all pages and made sure each user action follows correct route logic with validation and session checks.</w:t>
       </w:r>
     </w:p>
     <w:p>
@@ -311,7 +342,7 @@
         <w:pStyle w:val="Heading2"/>
       </w:pPr>
       <w:r>
-        <w:t>Role 2 - AI Integration and Prompt Engineering Engineer</w:t>
+        <w:t>Role 2 - AI Owner (ai_generator.py)</w:t>
       </w:r>
     </w:p>
     <w:p>
@@ -319,7 +350,7 @@
         <w:pStyle w:val="ListBullet"/>
       </w:pPr>
       <w:r>
-        <w:t>Owns ai_generator.py, model invocation, output shaping, and parsing robustness.</w:t>
+        <w:t>Own Groq API integration.</w:t>
       </w:r>
     </w:p>
     <w:p>
@@ -327,7 +358,7 @@
         <w:pStyle w:val="ListBullet"/>
       </w:pPr>
       <w:r>
-        <w:t>Designs strict prompts for deterministic JSON schema-like output.</w:t>
+        <w:t>Own prompt writing for quiz and flashcards.</w:t>
       </w:r>
     </w:p>
     <w:p>
@@ -335,7 +366,7 @@
         <w:pStyle w:val="ListBullet"/>
       </w:pPr>
       <w:r>
-        <w:t>Ensures generated data maps directly to frontend templates and DB schema.</w:t>
+        <w:t>Own output parsing and JSON conversion.</w:t>
       </w:r>
     </w:p>
     <w:p>
@@ -343,7 +374,7 @@
         <w:pStyle w:val="ListBullet"/>
       </w:pPr>
       <w:r>
-        <w:t>Maintains balance between creativity and reliability using generation parameters.</w:t>
+        <w:t>Answer all AI-related reliability questions.</w:t>
       </w:r>
     </w:p>
     <w:p>
@@ -351,7 +382,7 @@
         <w:rPr>
           <w:b/>
         </w:rPr>
-        <w:t>Important code logic snippets to explain:</w:t>
+        <w:t>Important logic you should remember:</w:t>
       </w:r>
     </w:p>
     <w:p>
@@ -369,16 +400,7 @@
           <w:rFonts w:ascii="Consolas" w:hAnsi="Consolas"/>
           <w:sz w:val="20"/>
         </w:rPr>
-        <w:t>prompt = f'''... Return ONLY a valid JSON array ...'''</w:t>
-      </w:r>
-    </w:p>
-    <w:p>
-      <w:r>
-        <w:rPr>
-          <w:rFonts w:ascii="Consolas" w:hAnsi="Consolas"/>
-          <w:sz w:val="20"/>
-        </w:rPr>
-        <w:t>response = client.chat.completions.create(model='llama-3.3-70b-versatile', ...)</w:t>
+        <w:t>response = client.chat.completions.create(...)</w:t>
       </w:r>
     </w:p>
     <w:p>
@@ -396,7 +418,7 @@
           <w:rFonts w:ascii="Consolas" w:hAnsi="Consolas"/>
           <w:sz w:val="20"/>
         </w:rPr>
-        <w:t>raw = re.sub(r'```json|```', '', raw).strip()</w:t>
+        <w:t>raw = re.sub(r'```json|```', '', raw)</w:t>
       </w:r>
     </w:p>
     <w:p>
@@ -405,7 +427,7 @@
           <w:rFonts w:ascii="Consolas" w:hAnsi="Consolas"/>
           <w:sz w:val="20"/>
         </w:rPr>
-        <w:t>questions = json.loads(raw)</w:t>
+        <w:t>questions/cards = json.loads(raw)</w:t>
       </w:r>
     </w:p>
     <w:p>
@@ -413,7 +435,7 @@
         <w:rPr>
           <w:b/>
         </w:rPr>
-        <w:t>Detailed viva Q&amp;A for Role 2:</w:t>
+        <w:t>Detailed viva Q&amp;A (Role 2):</w:t>
       </w:r>
     </w:p>
     <w:p>
@@ -421,7 +443,7 @@
         <w:pStyle w:val="ListBullet"/>
       </w:pPr>
       <w:r>
-        <w:t>Q: Why prompt with explicit format examples? A: LLMs perform better when output constraints are concrete. We include exact key names and structure so parsing is reliable and templates can consume data directly.</w:t>
+        <w:t>Q: Why strict prompt format? A: We need machine-readable output. If output is plain paragraph, app cannot show quiz options properly. So prompt forces JSON structure.</w:t>
       </w:r>
     </w:p>
     <w:p>
@@ -429,7 +451,7 @@
         <w:pStyle w:val="ListBullet"/>
       </w:pPr>
       <w:r>
-        <w:t>Q: Why remove markdown fences before parsing? A: Models sometimes return JSON wrapped in ```json blocks. Without cleanup, json.loads would raise parsing errors.</w:t>
+        <w:t>Q: Why remove ```json from output? A: Sometimes model wraps answer inside markdown code block. json.loads fails on that. We remove those wrappers before parsing.</w:t>
       </w:r>
     </w:p>
     <w:p>
@@ -437,7 +459,7 @@
         <w:pStyle w:val="ListBullet"/>
       </w:pPr>
       <w:r>
-        <w:t>Q: Why keep text[:6000] in prompt? A: To control token size, cost, latency, and model context overflow risk while still preserving enough source material for quality questions.</w:t>
+        <w:t>Q: Why text[:6000]? A: To control token size and keep API response practical. It avoids too large prompt and helps cost and speed.</w:t>
       </w:r>
     </w:p>
     <w:p>
@@ -445,7 +467,7 @@
         <w:pStyle w:val="ListBullet"/>
       </w:pPr>
       <w:r>
-        <w:t>Q: How do you improve malformed output handling? A: Add JSON schema validation, fallback re-prompt with correction prompt, and exception-safe response to user.</w:t>
+        <w:t>Q: What if API key is missing? A: Groq client fails at startup. We must set GROQ_API_KEY in .env.</w:t>
       </w:r>
     </w:p>
     <w:p>
@@ -453,7 +475,23 @@
         <w:pStyle w:val="ListBullet"/>
       </w:pPr>
       <w:r>
-        <w:t>Q: Why temperature 0.7? A: It keeps outputs varied enough for learning value while not becoming too random or drifting from source material.</w:t>
+        <w:t>Q: Can model give wrong answers? A: Yes, AI can be imperfect. Our app is for learning support, so users should review generated content for high-stakes use.</w:t>
+      </w:r>
+    </w:p>
+    <w:p>
+      <w:r>
+        <w:rPr>
+          <w:b/>
+        </w:rPr>
+        <w:t>What this member should say in presentation:</w:t>
+      </w:r>
+    </w:p>
+    <w:p>
+      <w:r>
+        <w:rPr>
+          <w:b w:val="0"/>
+        </w:rPr>
+        <w:t>I handled AI integration and prompt engineering. I made sure model output comes in proper JSON so app can directly save and show quizzes/flashcards.</w:t>
       </w:r>
     </w:p>
     <w:p>
@@ -461,7 +499,7 @@
         <w:pStyle w:val="Heading2"/>
       </w:pPr>
       <w:r>
-        <w:t>Role 3 - Content Extraction and Preprocessing Engineer</w:t>
+        <w:t>Role 3 - File Extraction Owner (extractor.py)</w:t>
       </w:r>
     </w:p>
     <w:p>
@@ -469,7 +507,7 @@
         <w:pStyle w:val="ListBullet"/>
       </w:pPr>
       <w:r>
-        <w:t>Owns extractor.py and data readiness checks before AI generation.</w:t>
+        <w:t>Own file reading pipeline.</w:t>
       </w:r>
     </w:p>
     <w:p>
@@ -477,7 +515,7 @@
         <w:pStyle w:val="ListBullet"/>
       </w:pPr>
       <w:r>
-        <w:t>Maintains support matrix for document/image types.</w:t>
+        <w:t>Own format handling for pdf/image/docx/pptx.</w:t>
       </w:r>
     </w:p>
     <w:p>
@@ -485,7 +523,7 @@
         <w:pStyle w:val="ListBullet"/>
       </w:pPr>
       <w:r>
-        <w:t>Optimizes extraction quality and handles format-specific parsing behavior.</w:t>
+        <w:t>Own OCR setup and extraction quality logic.</w:t>
       </w:r>
     </w:p>
     <w:p>
@@ -493,7 +531,7 @@
         <w:pStyle w:val="ListBullet"/>
       </w:pPr>
       <w:r>
-        <w:t>Responsible for minimizing garbage-in to improve AI output relevance.</w:t>
+        <w:t>Answer all document-processing questions.</w:t>
       </w:r>
     </w:p>
     <w:p>
@@ -501,7 +539,7 @@
         <w:rPr>
           <w:b/>
         </w:rPr>
-        <w:t>Important code logic snippets to explain:</w:t>
+        <w:t>Important logic you should remember:</w:t>
       </w:r>
     </w:p>
     <w:p>
@@ -510,7 +548,7 @@
           <w:rFonts w:ascii="Consolas" w:hAnsi="Consolas"/>
           <w:sz w:val="20"/>
         </w:rPr>
-        <w:t>ext = os.path.splitext(file_path)[1].lower()</w:t>
+        <w:t>if ext == '.pdf': extract_from_pdf(file_path)</w:t>
       </w:r>
     </w:p>
     <w:p>
@@ -519,7 +557,7 @@
           <w:rFonts w:ascii="Consolas" w:hAnsi="Consolas"/>
           <w:sz w:val="20"/>
         </w:rPr>
-        <w:t>if ext == '.pdf': return extract_from_pdf(file_path)</w:t>
+        <w:t>elif ext in ['.png', '.jpg', '.jpeg', '.webp']: extract_from_image(file_path)</w:t>
       </w:r>
     </w:p>
     <w:p>
@@ -528,7 +566,7 @@
           <w:rFonts w:ascii="Consolas" w:hAnsi="Consolas"/>
           <w:sz w:val="20"/>
         </w:rPr>
-        <w:t>elif ext in ['.png', '.jpg', '.jpeg', '.webp']: return extract_from_image(file_path)</w:t>
+        <w:t>elif ext == '.docx': extract_from_docx(file_path)</w:t>
       </w:r>
     </w:p>
     <w:p>
@@ -537,7 +575,7 @@
           <w:rFonts w:ascii="Consolas" w:hAnsi="Consolas"/>
           <w:sz w:val="20"/>
         </w:rPr>
-        <w:t>elif ext == '.docx': return extract_from_docx(file_path)</w:t>
+        <w:t>elif ext in ['.pptx', '.ppt']: extract_from_pptx(file_path)</w:t>
       </w:r>
     </w:p>
     <w:p>
@@ -546,7 +584,119 @@
           <w:rFonts w:ascii="Consolas" w:hAnsi="Consolas"/>
           <w:sz w:val="20"/>
         </w:rPr>
-        <w:t>elif ext in ['.pptx', '.ppt']: return extract_from_pptx(file_path)</w:t>
+        <w:t>pytesseract.pytesseract.tesseract_cmd = '...tesseract.exe'</w:t>
+      </w:r>
+    </w:p>
+    <w:p>
+      <w:r>
+        <w:rPr>
+          <w:b/>
+        </w:rPr>
+        <w:t>Detailed viva Q&amp;A (Role 3):</w:t>
+      </w:r>
+    </w:p>
+    <w:p>
+      <w:pPr>
+        <w:pStyle w:val="ListBullet"/>
+      </w:pPr>
+      <w:r>
+        <w:t>Q: Why extraction step is needed? A: AI model takes text input, not file binaries. So we convert different file formats to plain text first.</w:t>
+      </w:r>
+    </w:p>
+    <w:p>
+      <w:pPr>
+        <w:pStyle w:val="ListBullet"/>
+      </w:pPr>
+      <w:r>
+        <w:t>Q: Why OCR for images? A: Image files have visual text, not machine text. OCR reads visible characters and converts them to text.</w:t>
+      </w:r>
+    </w:p>
+    <w:p>
+      <w:pPr>
+        <w:pStyle w:val="ListBullet"/>
+      </w:pPr>
+      <w:r>
+        <w:t>Q: Why text length check in app.py? A: If extracted text is too small, AI output becomes weak or irrelevant. So app asks user for better input file.</w:t>
+      </w:r>
+    </w:p>
+    <w:p>
+      <w:pPr>
+        <w:pStyle w:val="ListBullet"/>
+      </w:pPr>
+      <w:r>
+        <w:t>Q: What if OCR fails? A: Usually due to low quality image or missing tesseract install. We can improve by better image preprocessing and setup checks.</w:t>
+      </w:r>
+    </w:p>
+    <w:p>
+      <w:pPr>
+        <w:pStyle w:val="ListBullet"/>
+      </w:pPr>
+      <w:r>
+        <w:t>Q: Why different libraries for each format? A: Each format has different internal structure; one library cannot parse all reliably.</w:t>
+      </w:r>
+    </w:p>
+    <w:p>
+      <w:r>
+        <w:rPr>
+          <w:b/>
+        </w:rPr>
+        <w:t>What this member should say in presentation:</w:t>
+      </w:r>
+    </w:p>
+    <w:p>
+      <w:r>
+        <w:rPr>
+          <w:b w:val="0"/>
+        </w:rPr>
+        <w:t>I handled file-to-text conversion pipeline. I made sure uploaded files from different formats are converted into clean text before AI generation.</w:t>
+      </w:r>
+    </w:p>
+    <w:p>
+      <w:pPr>
+        <w:pStyle w:val="Heading2"/>
+      </w:pPr>
+      <w:r>
+        <w:t>Role 4 - Database + UI Owner (database.py + templates)</w:t>
+      </w:r>
+    </w:p>
+    <w:p>
+      <w:pPr>
+        <w:pStyle w:val="ListBullet"/>
+      </w:pPr>
+      <w:r>
+        <w:t>Own SQLite schema and data operations.</w:t>
+      </w:r>
+    </w:p>
+    <w:p>
+      <w:pPr>
+        <w:pStyle w:val="ListBullet"/>
+      </w:pPr>
+      <w:r>
+        <w:t>Own save/history/delete and score update behavior.</w:t>
+      </w:r>
+    </w:p>
+    <w:p>
+      <w:pPr>
+        <w:pStyle w:val="ListBullet"/>
+      </w:pPr>
+      <w:r>
+        <w:t>Own user-facing page flow quality.</w:t>
+      </w:r>
+    </w:p>
+    <w:p>
+      <w:pPr>
+        <w:pStyle w:val="ListBullet"/>
+      </w:pPr>
+      <w:r>
+        <w:t>Answer all data and UI continuity questions.</w:t>
+      </w:r>
+    </w:p>
+    <w:p>
+      <w:r>
+        <w:rPr>
+          <w:b/>
+        </w:rPr>
+        <w:t>Important logic you should remember:</w:t>
       </w:r>
     </w:p>
     <w:p>
@@ -555,103 +705,7 @@
           <w:rFonts w:ascii="Consolas" w:hAnsi="Consolas"/>
           <w:sz w:val="20"/>
         </w:rPr>
-        <w:t>pytesseract.pytesseract.tesseract_cmd = r'C:\Program Files\Tesseract-OCR\tesseract.exe'</w:t>
-      </w:r>
-    </w:p>
-    <w:p>
-      <w:r>
-        <w:rPr>
-          <w:b/>
-        </w:rPr>
-        <w:t>Detailed viva Q&amp;A for Role 3:</w:t>
-      </w:r>
-    </w:p>
-    <w:p>
-      <w:pPr>
-        <w:pStyle w:val="ListBullet"/>
-      </w:pPr>
-      <w:r>
-        <w:t>Q: Why not send raw files directly to AI? A: Model APIs require textual context. Extractor converts heterogeneous documents to a unified plain-text representation first.</w:t>
-      </w:r>
-    </w:p>
-    <w:p>
-      <w:pPr>
-        <w:pStyle w:val="ListBullet"/>
-      </w:pPr>
-      <w:r>
-        <w:t>Q: Why OCR dependency is external? A: pytesseract is a Python wrapper; actual OCR engine is native Tesseract executable, so path configuration is required.</w:t>
-      </w:r>
-    </w:p>
-    <w:p>
-      <w:pPr>
-        <w:pStyle w:val="ListBullet"/>
-      </w:pPr>
-      <w:r>
-        <w:t>Q: What is key extraction risk for scanned PDFs? A: If PDF has only image layers and no embedded text, pdfplumber can return empty; OCR fallback for scanned PDFs can be added as enhancement.</w:t>
-      </w:r>
-    </w:p>
-    <w:p>
-      <w:pPr>
-        <w:pStyle w:val="ListBullet"/>
-      </w:pPr>
-      <w:r>
-        <w:t>Q: Why check minimum extracted text length? A: Low textual context leads to hallucinated or poor quality content; minimum threshold preserves educational usefulness.</w:t>
-      </w:r>
-    </w:p>
-    <w:p>
-      <w:pPr>
-        <w:pStyle w:val="ListBullet"/>
-      </w:pPr>
-      <w:r>
-        <w:t>Q: How to improve extraction quality further? A: Add preprocessing (denoise, thresholding), language packs, and per-format fallback chains.</w:t>
-      </w:r>
-    </w:p>
-    <w:p>
-      <w:pPr>
-        <w:pStyle w:val="Heading2"/>
-      </w:pPr>
-      <w:r>
-        <w:t>Role 4 - Database, Persistence, and Frontend Delivery Engineer</w:t>
-      </w:r>
-    </w:p>
-    <w:p>
-      <w:pPr>
-        <w:pStyle w:val="ListBullet"/>
-      </w:pPr>
-      <w:r>
-        <w:t>Owns database.py and template-driven user experience.</w:t>
-      </w:r>
-    </w:p>
-    <w:p>
-      <w:pPr>
-        <w:pStyle w:val="ListBullet"/>
-      </w:pPr>
-      <w:r>
-        <w:t>Designs relational schema and persistence lifecycle for generated artifacts.</w:t>
-      </w:r>
-    </w:p>
-    <w:p>
-      <w:pPr>
-        <w:pStyle w:val="ListBullet"/>
-      </w:pPr>
-      <w:r>
-        <w:t>Ensures users see personalized, saved, and retrievable study content.</w:t>
-      </w:r>
-    </w:p>
-    <w:p>
-      <w:pPr>
-        <w:pStyle w:val="ListBullet"/>
-      </w:pPr>
-      <w:r>
-        <w:t>Maintains frontend continuity from generation to history and deletion actions.</w:t>
-      </w:r>
-    </w:p>
-    <w:p>
-      <w:r>
-        <w:rPr>
-          <w:b/>
-        </w:rPr>
-        <w:t>Important code logic snippets to explain:</w:t>
+        <w:t>CREATE TABLE users (...)</w:t>
       </w:r>
     </w:p>
     <w:p>
@@ -660,7 +714,7 @@
           <w:rFonts w:ascii="Consolas" w:hAnsi="Consolas"/>
           <w:sz w:val="20"/>
         </w:rPr>
-        <w:t>CREATE TABLE users (... email TEXT UNIQUE NOT NULL, password TEXT NOT NULL ...)</w:t>
+        <w:t>CREATE TABLE saved_quizzes (...)</w:t>
       </w:r>
     </w:p>
     <w:p>
@@ -669,7 +723,7 @@
           <w:rFonts w:ascii="Consolas" w:hAnsi="Consolas"/>
           <w:sz w:val="20"/>
         </w:rPr>
-        <w:t>CREATE TABLE saved_quizzes (... questions TEXT NOT NULL, score TEXT DEFAULT NULL ...)</w:t>
+        <w:t>CREATE TABLE saved_flashcards (...)</w:t>
       </w:r>
     </w:p>
     <w:p>
@@ -678,7 +732,7 @@
           <w:rFonts w:ascii="Consolas" w:hAnsi="Consolas"/>
           <w:sz w:val="20"/>
         </w:rPr>
-        <w:t>CREATE TABLE saved_flashcards (... cards TEXT NOT NULL ...)</w:t>
+        <w:t>save_quiz(... json.dumps(questions))</w:t>
       </w:r>
     </w:p>
     <w:p>
@@ -687,7 +741,7 @@
           <w:rFonts w:ascii="Consolas" w:hAnsi="Consolas"/>
           <w:sz w:val="20"/>
         </w:rPr>
-        <w:t>cursor.execute('INSERT INTO saved_quizzes ...', (user_id, title, json.dumps(questions)))</w:t>
+        <w:t>update_quiz_score(quiz_id, score)</w:t>
       </w:r>
     </w:p>
     <w:p>
@@ -696,16 +750,7 @@
           <w:rFonts w:ascii="Consolas" w:hAnsi="Consolas"/>
           <w:sz w:val="20"/>
         </w:rPr>
-        <w:t>cursor.execute('UPDATE saved_quizzes SET score = ? WHERE id = ?', (score, quiz_id))</w:t>
-      </w:r>
-    </w:p>
-    <w:p>
-      <w:r>
-        <w:rPr>
-          <w:rFonts w:ascii="Consolas" w:hAnsi="Consolas"/>
-          <w:sz w:val="20"/>
-        </w:rPr>
-        <w:t>SELECT * FROM saved_quizzes WHERE user_id = ? ORDER BY created_at DESC</w:t>
+        <w:t>get_user_quizzes(user_id), get_user_flashcards(user_id)</w:t>
       </w:r>
     </w:p>
     <w:p>
@@ -713,7 +758,7 @@
         <w:rPr>
           <w:b/>
         </w:rPr>
-        <w:t>Detailed viva Q&amp;A for Role 4:</w:t>
+        <w:t>Detailed viva Q&amp;A (Role 4):</w:t>
       </w:r>
     </w:p>
     <w:p>
@@ -721,7 +766,7 @@
         <w:pStyle w:val="ListBullet"/>
       </w:pPr>
       <w:r>
-        <w:t>Q: Why store questions/cards as TEXT JSON instead of normalized child tables? A: For this project scope, JSON storage reduces schema complexity and maps directly to variable-length AI outputs. In production, normalized schema may help analytics and querying.</w:t>
+        <w:t>Q: Why SQLite? A: Easy setup, file-based DB, perfect for project/demo. No separate DB server required.</w:t>
       </w:r>
     </w:p>
     <w:p>
@@ -729,7 +774,7 @@
         <w:pStyle w:val="ListBullet"/>
       </w:pPr>
       <w:r>
-        <w:t>Q: How is password security handled? A: Plain password is never stored. Registration hashes password using generate_password_hash and login verifies using check_password_hash.</w:t>
+        <w:t>Q: Why save questions/cards as JSON text? A: AI output is variable-length nested data. JSON text is simple and flexible for this project.</w:t>
       </w:r>
     </w:p>
     <w:p>
@@ -737,7 +782,7 @@
         <w:pStyle w:val="ListBullet"/>
       </w:pPr>
       <w:r>
-        <w:t>Q: Why SQLite? A: Zero-setup, lightweight file DB ideal for demonstration and moderate local usage. Production can migrate to PostgreSQL without changing high-level architecture.</w:t>
+        <w:t>Q: How are passwords secured? A: We hash passwords before storing. At login we compare hash, not plain password.</w:t>
       </w:r>
     </w:p>
     <w:p>
@@ -745,7 +790,7 @@
         <w:pStyle w:val="ListBullet"/>
       </w:pPr>
       <w:r>
-        <w:t>Q: How is user data isolation maintained? A: Each quiz/flashcard row stores user_id; every history query filters by current session user_id.</w:t>
+        <w:t>Q: How is user data separated? A: Each quiz/flashcard row has user_id, and queries filter by current logged-in user_id.</w:t>
       </w:r>
     </w:p>
     <w:p>
@@ -753,7 +798,23 @@
         <w:pStyle w:val="ListBullet"/>
       </w:pPr>
       <w:r>
-        <w:t>Q: Why order by created_at DESC? A: UX-first choice to show latest generated content first for faster access.</w:t>
+        <w:t>Q: How score is saved? A: Frontend sends quiz_id and score to /save_score route, then DB updates that quiz row.</w:t>
+      </w:r>
+    </w:p>
+    <w:p>
+      <w:r>
+        <w:rPr>
+          <w:b/>
+        </w:rPr>
+        <w:t>What this member should say in presentation:</w:t>
+      </w:r>
+    </w:p>
+    <w:p>
+      <w:r>
+        <w:rPr>
+          <w:b w:val="0"/>
+        </w:rPr>
+        <w:t>I handled storage and user experience. I ensured generated content is saved correctly, shown in history, and managed with delete and score tracking features.</w:t>
       </w:r>
     </w:p>
     <w:p>
@@ -761,7 +822,7 @@
         <w:pStyle w:val="Heading1"/>
       </w:pPr>
       <w:r>
-        <w:t>D. Full Code Logic Map (Function-wise)</w:t>
+        <w:t>4) Project-Wide Viva Questions (Very Detailed but Easy)</w:t>
       </w:r>
     </w:p>
     <w:p>
@@ -769,7 +830,7 @@
         <w:pStyle w:val="ListBullet"/>
       </w:pPr>
       <w:r>
-        <w:t>allowed_file(filename): validates extension against whitelist.</w:t>
+        <w:t>Q: Explain complete project flow in simple way. A: User uploads study file, backend extracts text, AI generates structured learning content, app saves it in DB, and user can practice/review any time from history.</w:t>
       </w:r>
     </w:p>
     <w:p>
@@ -777,7 +838,7 @@
         <w:pStyle w:val="ListBullet"/>
       </w:pPr>
       <w:r>
-        <w:t>login_required(f): wrapper that redirects unauthenticated users to login page.</w:t>
+        <w:t>Q: Why this project is useful for students? A: It reduces manual effort of creating questions/flashcards and helps active recall, which improves memory retention.</w:t>
       </w:r>
     </w:p>
     <w:p>
@@ -785,7 +846,7 @@
         <w:pStyle w:val="ListBullet"/>
       </w:pPr>
       <w:r>
-        <w:t>register/login/logout: account lifecycle and session initialization/cleanup.</w:t>
+        <w:t>Q: Why modular files are used? A: Separation makes code easier to understand, debug, and divide among team members during development and viva.</w:t>
       </w:r>
     </w:p>
     <w:p>
@@ -793,7 +854,7 @@
         <w:pStyle w:val="ListBullet"/>
       </w:pPr>
       <w:r>
-        <w:t>process(): central pipeline that coordinates upload, extraction, AI generation, DB save, and redirect.</w:t>
+        <w:t>Q: What are current limitations? A: Hardcoded Flask secret key, limited error handling for malformed AI JSON, and SQLite not ideal for high-concurrency production.</w:t>
       </w:r>
     </w:p>
     <w:p>
@@ -801,7 +862,7 @@
         <w:pStyle w:val="ListBullet"/>
       </w:pPr>
       <w:r>
-        <w:t>quiz()/flashcard(): fetch persisted JSON text, deserialize with json.loads, render template.</w:t>
+        <w:t>Q: How to improve if given more time? A: Add better exception handling, CSRF, move secrets to env, background workers for AI calls, and migrate DB to PostgreSQL.</w:t>
       </w:r>
     </w:p>
     <w:p>
@@ -809,7 +870,7 @@
         <w:pStyle w:val="ListBullet"/>
       </w:pPr>
       <w:r>
-        <w:t>save_score(): AJAX endpoint that updates quiz score asynchronously.</w:t>
+        <w:t>Q: What breaks if internet is off? A: New AI generation fails (API call needed), but existing user accounts/history stored in local SQLite still work.</w:t>
       </w:r>
     </w:p>
     <w:p>
@@ -817,7 +878,87 @@
         <w:pStyle w:val="ListBullet"/>
       </w:pPr>
       <w:r>
-        <w:t>history(): combines quiz and flashcard history and computes item counts for display.</w:t>
+        <w:t>Q: Why not build everything in one file? A: Single file becomes hard to explain and maintain. Modular design gives cleaner ownership and better readability.</w:t>
+      </w:r>
+    </w:p>
+    <w:p>
+      <w:pPr>
+        <w:pStyle w:val="Heading1"/>
+      </w:pPr>
+      <w:r>
+        <w:t>5) Fast Speaking Script (For Tomorrow Presentation)</w:t>
+      </w:r>
+    </w:p>
+    <w:p>
+      <w:r>
+        <w:rPr>
+          <w:b/>
+        </w:rPr>
+        <w:t>Member 1 quick script:</w:t>
+      </w:r>
+    </w:p>
+    <w:p>
+      <w:r>
+        <w:rPr>
+          <w:b w:val="0"/>
+        </w:rPr>
+        <w:t>I handled backend routes and overall flow. My part ensures user can register/login, upload files, and reach generated quiz/flashcard pages safely.</w:t>
+      </w:r>
+    </w:p>
+    <w:p>
+      <w:r>
+        <w:rPr>
+          <w:b/>
+        </w:rPr>
+        <w:t>Member 2 quick script:</w:t>
+      </w:r>
+    </w:p>
+    <w:p>
+      <w:r>
+        <w:rPr>
+          <w:b w:val="0"/>
+        </w:rPr>
+        <w:t>I handled AI integration. I wrote prompts so model gives structured JSON output which our app can save and display directly.</w:t>
+      </w:r>
+    </w:p>
+    <w:p>
+      <w:r>
+        <w:rPr>
+          <w:b/>
+        </w:rPr>
+        <w:t>Member 3 quick script:</w:t>
+      </w:r>
+    </w:p>
+    <w:p>
+      <w:r>
+        <w:rPr>
+          <w:b w:val="0"/>
+        </w:rPr>
+        <w:t>I handled file extraction. I implemented format-wise extraction and OCR so uploaded material becomes usable text for AI.</w:t>
+      </w:r>
+    </w:p>
+    <w:p>
+      <w:r>
+        <w:rPr>
+          <w:b/>
+        </w:rPr>
+        <w:t>Member 4 quick script:</w:t>
+      </w:r>
+    </w:p>
+    <w:p>
+      <w:r>
+        <w:rPr>
+          <w:b w:val="0"/>
+        </w:rPr>
+        <w:t>I handled database and UI continuity. I ensured generated data is stored per user and available in dashboard/history with score updates.</w:t>
+      </w:r>
+    </w:p>
+    <w:p>
+      <w:pPr>
+        <w:pStyle w:val="Heading1"/>
+      </w:pPr>
+      <w:r>
+        <w:t>6) Last-Minute Revision Checklist</w:t>
       </w:r>
     </w:p>
     <w:p>
@@ -825,15 +966,7 @@
         <w:pStyle w:val="ListBullet"/>
       </w:pPr>
       <w:r>
-        <w:t>delete routes: remove persisted artifacts from DB.</w:t>
-      </w:r>
-    </w:p>
-    <w:p>
-      <w:pPr>
-        <w:pStyle w:val="Heading1"/>
-      </w:pPr>
-      <w:r>
-        <w:t>E. Design Decisions and Justifications</w:t>
+        <w:t>Remember what each file does: app.py, database.py, extractor.py, ai_generator.py.</w:t>
       </w:r>
     </w:p>
     <w:p>
@@ -841,7 +974,7 @@
         <w:pStyle w:val="ListBullet"/>
       </w:pPr>
       <w:r>
-        <w:t>Single app.py chosen for clarity and easier viva explanation; modular helpers still keep separation of concerns.</w:t>
+        <w:t>Remember one complete flow from upload to output page.</w:t>
       </w:r>
     </w:p>
     <w:p>
@@ -849,7 +982,7 @@
         <w:pStyle w:val="ListBullet"/>
       </w:pPr>
       <w:r>
-        <w:t>Synchronous pipeline selected for simplicity; async jobs can be future enhancement.</w:t>
+        <w:t>Remember 3 limitations and 3 future improvements.</w:t>
       </w:r>
     </w:p>
     <w:p>
@@ -857,7 +990,7 @@
         <w:pStyle w:val="ListBullet"/>
       </w:pPr>
       <w:r>
-        <w:t>Template rendering used over SPA to keep stack minimal and development faster.</w:t>
+        <w:t>Remember your own role's accountability statement.</w:t>
       </w:r>
     </w:p>
     <w:p>
@@ -865,359 +998,7 @@
         <w:pStyle w:val="ListBullet"/>
       </w:pPr>
       <w:r>
-        <w:t>JSON output contract from AI selected to reduce transformation code and template complexity.</w:t>
-      </w:r>
-    </w:p>
-    <w:p>
-      <w:pPr>
-        <w:pStyle w:val="Heading1"/>
-      </w:pPr>
-      <w:r>
-        <w:t>F. Failure Scenarios and Recovery Answers (High-value viva)</w:t>
-      </w:r>
-    </w:p>
-    <w:p>
-      <w:pPr>
-        <w:pStyle w:val="ListBullet"/>
-      </w:pPr>
-      <w:r>
-        <w:t>Missing GROQ_API_KEY -&gt; AI client initialization fails. Recovery: set key in .env and restart.</w:t>
-      </w:r>
-    </w:p>
-    <w:p>
-      <w:pPr>
-        <w:pStyle w:val="ListBullet"/>
-      </w:pPr>
-      <w:r>
-        <w:t>Unsupported file extension -&gt; process route returns upload template with clear error.</w:t>
-      </w:r>
-    </w:p>
-    <w:p>
-      <w:pPr>
-        <w:pStyle w:val="ListBullet"/>
-      </w:pPr>
-      <w:r>
-        <w:t>Low text extraction -&gt; app refuses generation and asks for better file.</w:t>
-      </w:r>
-    </w:p>
-    <w:p>
-      <w:pPr>
-        <w:pStyle w:val="ListBullet"/>
-      </w:pPr>
-      <w:r>
-        <w:t>Malformed AI JSON -&gt; json.loads fails. Recommended fix: try/except + repair prompt + fallback message.</w:t>
-      </w:r>
-    </w:p>
-    <w:p>
-      <w:pPr>
-        <w:pStyle w:val="ListBullet"/>
-      </w:pPr>
-      <w:r>
-        <w:t>OCR binary missing -&gt; pytesseract cannot run. Recovery: install Tesseract and set correct executable path.</w:t>
-      </w:r>
-    </w:p>
-    <w:p>
-      <w:pPr>
-        <w:pStyle w:val="ListBullet"/>
-      </w:pPr>
-      <w:r>
-        <w:t>Multiple server processes on same port -&gt; stale output seen. Recovery: terminate duplicate PIDs and restart one clean server.</w:t>
-      </w:r>
-    </w:p>
-    <w:p>
-      <w:pPr>
-        <w:pStyle w:val="Heading1"/>
-      </w:pPr>
-      <w:r>
-        <w:t>G. Security Discussion (What to answer beyond basics)</w:t>
-      </w:r>
-    </w:p>
-    <w:p>
-      <w:pPr>
-        <w:pStyle w:val="ListBullet"/>
-      </w:pPr>
-      <w:r>
-        <w:t>Implemented security: hashed passwords, route auth checks, secure filenames, restricted file types.</w:t>
-      </w:r>
-    </w:p>
-    <w:p>
-      <w:pPr>
-        <w:pStyle w:val="ListBullet"/>
-      </w:pPr>
-      <w:r>
-        <w:t>Known gap: app.secret_key is hardcoded; should move to environment variable.</w:t>
-      </w:r>
-    </w:p>
-    <w:p>
-      <w:pPr>
-        <w:pStyle w:val="ListBullet"/>
-      </w:pPr>
-      <w:r>
-        <w:t>Known gap: no CSRF token enforcement on forms currently.</w:t>
-      </w:r>
-    </w:p>
-    <w:p>
-      <w:pPr>
-        <w:pStyle w:val="ListBullet"/>
-      </w:pPr>
-      <w:r>
-        <w:t>Known gap: no strict file content validation beyond extension check.</w:t>
-      </w:r>
-    </w:p>
-    <w:p>
-      <w:pPr>
-        <w:pStyle w:val="ListBullet"/>
-      </w:pPr>
-      <w:r>
-        <w:t>Known gap: no request throttling/rate limiting for heavy generation endpoints.</w:t>
-      </w:r>
-    </w:p>
-    <w:p>
-      <w:r>
-        <w:rPr>
-          <w:b/>
-        </w:rPr>
-        <w:t>How to present maturity:</w:t>
-      </w:r>
-    </w:p>
-    <w:p>
-      <w:r>
-        <w:rPr>
-          <w:b w:val="0"/>
-        </w:rPr>
-        <w:t>Mention that current version is a functional academic prototype, and list production hardening steps (CSRF, secret rotation, async queue, structured logs, stronger validation).</w:t>
-      </w:r>
-    </w:p>
-    <w:p>
-      <w:pPr>
-        <w:pStyle w:val="Heading1"/>
-      </w:pPr>
-      <w:r>
-        <w:t>H. Performance and Scalability Discussion</w:t>
-      </w:r>
-    </w:p>
-    <w:p>
-      <w:pPr>
-        <w:pStyle w:val="ListBullet"/>
-      </w:pPr>
-      <w:r>
-        <w:t>Current bottlenecks: OCR latency, AI API round-trip latency, synchronous request blocking.</w:t>
-      </w:r>
-    </w:p>
-    <w:p>
-      <w:pPr>
-        <w:pStyle w:val="ListBullet"/>
-      </w:pPr>
-      <w:r>
-        <w:t>Scaling plan: move AI generation to background workers (Celery/RQ), queue requests, add status polling.</w:t>
-      </w:r>
-    </w:p>
-    <w:p>
-      <w:pPr>
-        <w:pStyle w:val="ListBullet"/>
-      </w:pPr>
-      <w:r>
-        <w:t>DB scaling plan: migrate SQLite to PostgreSQL; add indexes on user_id and created_at.</w:t>
-      </w:r>
-    </w:p>
-    <w:p>
-      <w:pPr>
-        <w:pStyle w:val="ListBullet"/>
-      </w:pPr>
-      <w:r>
-        <w:t>Caching opportunity: cache extracted text hash to avoid reprocessing same files.</w:t>
-      </w:r>
-    </w:p>
-    <w:p>
-      <w:pPr>
-        <w:pStyle w:val="Heading1"/>
-      </w:pPr>
-      <w:r>
-        <w:t>I. Detailed Demo Script (Team order)</w:t>
-      </w:r>
-    </w:p>
-    <w:p>
-      <w:pPr>
-        <w:pStyle w:val="ListBullet"/>
-      </w:pPr>
-      <w:r>
-        <w:t>Member 1: Introduce architecture and auth flow.</w:t>
-      </w:r>
-    </w:p>
-    <w:p>
-      <w:pPr>
-        <w:pStyle w:val="ListBullet"/>
-      </w:pPr>
-      <w:r>
-        <w:t>Member 3: Show file upload and extraction explanation.</w:t>
-      </w:r>
-    </w:p>
-    <w:p>
-      <w:pPr>
-        <w:pStyle w:val="ListBullet"/>
-      </w:pPr>
-      <w:r>
-        <w:t>Member 2: Explain AI prompt, generation, and output format.</w:t>
-      </w:r>
-    </w:p>
-    <w:p>
-      <w:pPr>
-        <w:pStyle w:val="ListBullet"/>
-      </w:pPr>
-      <w:r>
-        <w:t>Member 4: Show saved results, score update, history, and delete flow.</w:t>
-      </w:r>
-    </w:p>
-    <w:p>
-      <w:pPr>
-        <w:pStyle w:val="ListBullet"/>
-      </w:pPr>
-      <w:r>
-        <w:t>All: conclude with limitations and future enhancements.</w:t>
-      </w:r>
-    </w:p>
-    <w:p>
-      <w:pPr>
-        <w:pStyle w:val="Heading1"/>
-      </w:pPr>
-      <w:r>
-        <w:t>J. Long-form Viva Questions with Detailed Answers</w:t>
-      </w:r>
-    </w:p>
-    <w:p>
-      <w:pPr>
-        <w:pStyle w:val="ListBullet"/>
-      </w:pPr>
-      <w:r>
-        <w:t>Q: Explain complete flow from upload to display with internal functions. A: /process receives mode and file, validates extension through allowed_file, stores file with secure_filename, extracts text via extractor.py based on extension, checks minimum length for quality, invokes AI generation function according to mode, stores JSON output in DB linked to current session user_id, removes temporary uploaded file, then redirects to result route that loads persisted JSON and renders templates.</w:t>
-      </w:r>
-    </w:p>
-    <w:p>
-      <w:pPr>
-        <w:pStyle w:val="ListBullet"/>
-      </w:pPr>
-      <w:r>
-        <w:t>Q: Why is modularization important here? A: Without modularization, app.py would be monolithic and hard to test/debug. By separating extraction, AI generation, and DB logic, each layer can be improved independently and role ownership becomes clear in team projects.</w:t>
-      </w:r>
-    </w:p>
-    <w:p>
-      <w:pPr>
-        <w:pStyle w:val="ListBullet"/>
-      </w:pPr>
-      <w:r>
-        <w:t>Q: What are ethical or academic concerns in AI-generated quizzes? A: Potential factual drift/hallucination if source text is weak. Mitigation is source-grounded prompts, stricter checks, and manual review for high-stakes usage.</w:t>
-      </w:r>
-    </w:p>
-    <w:p>
-      <w:pPr>
-        <w:pStyle w:val="ListBullet"/>
-      </w:pPr>
-      <w:r>
-        <w:t>Q: If internet goes down, what breaks and what still works? A: Registration/login/history and old content viewing continue (local DB). New quiz/flashcard generation fails because Groq API requires connectivity.</w:t>
-      </w:r>
-    </w:p>
-    <w:p>
-      <w:pPr>
-        <w:pStyle w:val="ListBullet"/>
-      </w:pPr>
-      <w:r>
-        <w:t>Q: How would you productionize this in 3 phases? A: Phase 1 security hardening (secret/env, CSRF, validation), Phase 2 reliability (error handling/retries/observability), Phase 3 scalability (async workers, PostgreSQL, deployment automation).</w:t>
-      </w:r>
-    </w:p>
-    <w:p>
-      <w:pPr>
-        <w:pStyle w:val="Heading1"/>
-      </w:pPr>
-      <w:r>
-        <w:t>K. Member-wise Final Accountability Statements</w:t>
-      </w:r>
-    </w:p>
-    <w:p>
-      <w:pPr>
-        <w:pStyle w:val="ListBullet"/>
-      </w:pPr>
-      <w:r>
-        <w:t>Member 1 (Backend): accountable for routing correctness, session flow, and integration glue.</w:t>
-      </w:r>
-    </w:p>
-    <w:p>
-      <w:pPr>
-        <w:pStyle w:val="ListBullet"/>
-      </w:pPr>
-      <w:r>
-        <w:t>Member 2 (AI): accountable for prompt quality, output structure, and generation reliability.</w:t>
-      </w:r>
-    </w:p>
-    <w:p>
-      <w:pPr>
-        <w:pStyle w:val="ListBullet"/>
-      </w:pPr>
-      <w:r>
-        <w:t>Member 3 (Extraction): accountable for robust text extraction and preprocessing quality.</w:t>
-      </w:r>
-    </w:p>
-    <w:p>
-      <w:pPr>
-        <w:pStyle w:val="ListBullet"/>
-      </w:pPr>
-      <w:r>
-        <w:t>Member 4 (DB + UI): accountable for persistence integrity, user history, and frontend usability.</w:t>
-      </w:r>
-    </w:p>
-    <w:p>
-      <w:pPr>
-        <w:pStyle w:val="Heading1"/>
-      </w:pPr>
-      <w:r>
-        <w:t>L. Rapid Revision Sheet (Night-before)</w:t>
-      </w:r>
-    </w:p>
-    <w:p>
-      <w:pPr>
-        <w:pStyle w:val="ListBullet"/>
-      </w:pPr>
-      <w:r>
-        <w:t>Know every major route and why it exists.</w:t>
-      </w:r>
-    </w:p>
-    <w:p>
-      <w:pPr>
-        <w:pStyle w:val="ListBullet"/>
-      </w:pPr>
-      <w:r>
-        <w:t>Know every table schema field and its purpose.</w:t>
-      </w:r>
-    </w:p>
-    <w:p>
-      <w:pPr>
-        <w:pStyle w:val="ListBullet"/>
-      </w:pPr>
-      <w:r>
-        <w:t>Know extraction path per file type and OCR dependency reason.</w:t>
-      </w:r>
-    </w:p>
-    <w:p>
-      <w:pPr>
-        <w:pStyle w:val="ListBullet"/>
-      </w:pPr>
-      <w:r>
-        <w:t>Know AI prompt strategy and JSON parsing logic.</w:t>
-      </w:r>
-    </w:p>
-    <w:p>
-      <w:pPr>
-        <w:pStyle w:val="ListBullet"/>
-      </w:pPr>
-      <w:r>
-        <w:t>Know at least 5 limitations and 5 future improvements.</w:t>
-      </w:r>
-    </w:p>
-    <w:p>
-      <w:pPr>
-        <w:pStyle w:val="ListBullet"/>
-      </w:pPr>
-      <w:r>
-        <w:t>Know who answers what in team presentation.</w:t>
+        <w:t>Speak slowly and explain in user-action language first, code language second.</w:t>
       </w:r>
     </w:p>
     <w:sectPr>

</xml_diff>